<commit_message>
Fixed formatting issues on some tables.
</commit_message>
<xml_diff>
--- a/04_QA_Review/Approved/Milestone_2_First_Dozen_Views/RA_M2_Comp_Diagram_Design_Info_Table_v01.docx
+++ b/04_QA_Review/Approved/Milestone_2_First_Dozen_Views/RA_M2_Comp_Diagram_Design_Info_Table_v01.docx
@@ -1,6 +1,6 @@
 
 <file path=word/document.xml><?xml version="1.0" encoding="utf-8"?>
-<w:document xmlns:wpc="http://schemas.microsoft.com/office/word/2010/wordprocessingCanvas" xmlns:cx="http://schemas.microsoft.com/office/drawing/2014/chartex" xmlns:cx1="http://schemas.microsoft.com/office/drawing/2015/9/8/chartex" xmlns:cx2="http://schemas.microsoft.com/office/drawing/2015/10/21/chartex" xmlns:cx3="http://schemas.microsoft.com/office/drawing/2016/5/9/chartex" xmlns:cx4="http://schemas.microsoft.com/office/drawing/2016/5/10/chartex" xmlns:cx5="http://schemas.microsoft.com/office/drawing/2016/5/11/chartex" xmlns:cx6="http://schemas.microsoft.com/office/drawing/2016/5/12/chartex" xmlns:cx7="http://schemas.microsoft.com/office/drawing/2016/5/13/chartex" xmlns:cx8="http://schemas.microsoft.com/office/drawing/2016/5/14/chartex" xmlns:mc="http://schemas.openxmlformats.org/markup-compatibility/2006" xmlns:aink="http://schemas.microsoft.com/office/drawing/2016/ink" xmlns:am3d="http://schemas.microsoft.com/office/drawing/2017/model3d" xmlns:o="urn:schemas-microsoft-com:office:office" xmlns:oel="http://schemas.microsoft.com/office/2019/extlst" xmlns:r="http://schemas.openxmlformats.org/officeDocument/2006/relationships" xmlns:m="http://schemas.openxmlformats.org/officeDocument/2006/math" xmlns:v="urn:schemas-microsoft-com:vml" xmlns:wp14="http://schemas.microsoft.com/office/word/2010/wordprocessingDrawing" xmlns:wp="http://schemas.openxmlformats.org/drawingml/2006/wordprocessingDrawing" xmlns:w10="urn:schemas-microsoft-com:office:word" xmlns:w="http://schemas.openxmlformats.org/wordprocessingml/2006/main" xmlns:w14="http://schemas.microsoft.com/office/word/2010/wordml" xmlns:w15="http://schemas.microsoft.com/office/word/2012/wordml" xmlns:w16cex="http://schemas.microsoft.com/office/word/2018/wordml/cex" xmlns:w16cid="http://schemas.microsoft.com/office/word/2016/wordml/cid" xmlns:w16="http://schemas.microsoft.com/office/word/2018/wordml" xmlns:w16sdtdh="http://schemas.microsoft.com/office/word/2020/wordml/sdtdatahash" xmlns:w16se="http://schemas.microsoft.com/office/word/2015/wordml/symex" xmlns:wpg="http://schemas.microsoft.com/office/word/2010/wordprocessingGroup" xmlns:wpi="http://schemas.microsoft.com/office/word/2010/wordprocessingInk" xmlns:wne="http://schemas.microsoft.com/office/word/2006/wordml" xmlns:wps="http://schemas.microsoft.com/office/word/2010/wordprocessingShape" mc:Ignorable="w14 w15 w16se w16cid w16 w16cex w16sdtdh wp14">
+<w:document xmlns:wpc="http://schemas.microsoft.com/office/word/2010/wordprocessingCanvas" xmlns:cx="http://schemas.microsoft.com/office/drawing/2014/chartex" xmlns:cx1="http://schemas.microsoft.com/office/drawing/2015/9/8/chartex" xmlns:cx2="http://schemas.microsoft.com/office/drawing/2015/10/21/chartex" xmlns:cx3="http://schemas.microsoft.com/office/drawing/2016/5/9/chartex" xmlns:cx4="http://schemas.microsoft.com/office/drawing/2016/5/10/chartex" xmlns:cx5="http://schemas.microsoft.com/office/drawing/2016/5/11/chartex" xmlns:cx6="http://schemas.microsoft.com/office/drawing/2016/5/12/chartex" xmlns:cx7="http://schemas.microsoft.com/office/drawing/2016/5/13/chartex" xmlns:cx8="http://schemas.microsoft.com/office/drawing/2016/5/14/chartex" xmlns:mc="http://schemas.openxmlformats.org/markup-compatibility/2006" xmlns:aink="http://schemas.microsoft.com/office/drawing/2016/ink" xmlns:am3d="http://schemas.microsoft.com/office/drawing/2017/model3d" xmlns:o="urn:schemas-microsoft-com:office:office" xmlns:oel="http://schemas.microsoft.com/office/2019/extlst" xmlns:r="http://schemas.openxmlformats.org/officeDocument/2006/relationships" xmlns:m="http://schemas.openxmlformats.org/officeDocument/2006/math" xmlns:v="urn:schemas-microsoft-com:vml" xmlns:wp14="http://schemas.microsoft.com/office/word/2010/wordprocessingDrawing" xmlns:wp="http://schemas.openxmlformats.org/drawingml/2006/wordprocessingDrawing" xmlns:w10="urn:schemas-microsoft-com:office:word" xmlns:w="http://schemas.openxmlformats.org/wordprocessingml/2006/main" xmlns:w14="http://schemas.microsoft.com/office/word/2010/wordml" xmlns:w15="http://schemas.microsoft.com/office/word/2012/wordml" xmlns:w16cex="http://schemas.microsoft.com/office/word/2018/wordml/cex" xmlns:w16cid="http://schemas.microsoft.com/office/word/2016/wordml/cid" xmlns:w16="http://schemas.microsoft.com/office/word/2018/wordml" xmlns:w16du="http://schemas.microsoft.com/office/word/2023/wordml/word16du" xmlns:w16sdtdh="http://schemas.microsoft.com/office/word/2020/wordml/sdtdatahash" xmlns:w16sdtfl="http://schemas.microsoft.com/office/word/2024/wordml/sdtformatlock" xmlns:w16se="http://schemas.microsoft.com/office/word/2015/wordml/symex" xmlns:wpg="http://schemas.microsoft.com/office/word/2010/wordprocessingGroup" xmlns:wpi="http://schemas.microsoft.com/office/word/2010/wordprocessingInk" xmlns:wne="http://schemas.microsoft.com/office/word/2006/wordml" xmlns:wps="http://schemas.microsoft.com/office/word/2010/wordprocessingShape" mc:Ignorable="w14 w15 w16se w16cid w16 w16cex w16sdtdh w16sdtfl w16du wp14">
   <w:body>
     <w:p>
       <w:pPr>
@@ -1834,10 +1834,10 @@
         <w:tblLook w:val="04A0" w:firstRow="1" w:lastRow="0" w:firstColumn="1" w:lastColumn="0" w:noHBand="0" w:noVBand="1"/>
       </w:tblPr>
       <w:tblGrid>
-        <w:gridCol w:w="2242"/>
-        <w:gridCol w:w="2884"/>
-        <w:gridCol w:w="2107"/>
-        <w:gridCol w:w="2107"/>
+        <w:gridCol w:w="2232"/>
+        <w:gridCol w:w="2896"/>
+        <w:gridCol w:w="2106"/>
+        <w:gridCol w:w="2106"/>
       </w:tblGrid>
       <w:tr>
         <w:trPr>
@@ -4525,6 +4525,10 @@
       </w:r>
     </w:p>
     <w:p>
+      <w:pPr>
+        <w:keepNext/>
+        <w:spacing w:before="240" w:line="278" w:lineRule="auto"/>
+      </w:pPr>
       <w:r>
         <w:rPr>
           <w:rFonts w:ascii="Arial" w:eastAsia="Times New Roman" w:hAnsi="Arial" w:cs="Arial"/>
@@ -4532,6 +4536,7 @@
           <w:bCs/>
           <w:lang w:eastAsia="en-US"/>
         </w:rPr>
+        <w:lastRenderedPageBreak/>
         <w:t>Design Information</w:t>
       </w:r>
     </w:p>
@@ -4567,7 +4572,6 @@
               <w:rPr>
                 <w:rFonts w:ascii="Arial" w:eastAsia="Times New Roman" w:hAnsi="Arial" w:cs="Arial"/>
               </w:rPr>
-              <w:lastRenderedPageBreak/>
               <w:t>Field</w:t>
             </w:r>
           </w:p>
@@ -4964,9 +4968,6 @@
             <w:cnfStyle w:val="001000000000" w:firstRow="0" w:lastRow="0" w:firstColumn="1" w:lastColumn="0" w:oddVBand="0" w:evenVBand="0" w:oddHBand="0" w:evenHBand="0" w:firstRowFirstColumn="0" w:firstRowLastColumn="0" w:lastRowFirstColumn="0" w:lastRowLastColumn="0"/>
             <w:tcW w:w="0" w:type="auto"/>
             <w:vMerge/>
-            <w:tcBorders>
-              <w:bottom w:val="nil"/>
-            </w:tcBorders>
           </w:tcPr>
           <w:p>
             <w:pPr>
@@ -5005,10 +5006,7 @@
           <w:tcPr>
             <w:cnfStyle w:val="001000000000" w:firstRow="0" w:lastRow="0" w:firstColumn="1" w:lastColumn="0" w:oddVBand="0" w:evenVBand="0" w:oddHBand="0" w:evenHBand="0" w:firstRowFirstColumn="0" w:firstRowLastColumn="0" w:lastRowFirstColumn="0" w:lastRowLastColumn="0"/>
             <w:tcW w:w="0" w:type="auto"/>
-            <w:tcBorders>
-              <w:top w:val="nil"/>
-              <w:bottom w:val="nil"/>
-            </w:tcBorders>
+            <w:vMerge/>
             <w:shd w:val="clear" w:color="auto" w:fill="D1D1D1" w:themeFill="background2" w:themeFillShade="E6"/>
           </w:tcPr>
           <w:p>
@@ -5051,10 +5049,7 @@
           <w:tcPr>
             <w:cnfStyle w:val="001000000000" w:firstRow="0" w:lastRow="0" w:firstColumn="1" w:lastColumn="0" w:oddVBand="0" w:evenVBand="0" w:oddHBand="0" w:evenHBand="0" w:firstRowFirstColumn="0" w:firstRowLastColumn="0" w:lastRowFirstColumn="0" w:lastRowLastColumn="0"/>
             <w:tcW w:w="0" w:type="auto"/>
-            <w:tcBorders>
-              <w:top w:val="nil"/>
-              <w:bottom w:val="nil"/>
-            </w:tcBorders>
+            <w:vMerge/>
             <w:shd w:val="clear" w:color="auto" w:fill="D1D1D1" w:themeFill="background2" w:themeFillShade="E6"/>
           </w:tcPr>
           <w:p>
@@ -5094,10 +5089,7 @@
           <w:tcPr>
             <w:cnfStyle w:val="001000000000" w:firstRow="0" w:lastRow="0" w:firstColumn="1" w:lastColumn="0" w:oddVBand="0" w:evenVBand="0" w:oddHBand="0" w:evenHBand="0" w:firstRowFirstColumn="0" w:firstRowLastColumn="0" w:lastRowFirstColumn="0" w:lastRowLastColumn="0"/>
             <w:tcW w:w="0" w:type="auto"/>
-            <w:tcBorders>
-              <w:top w:val="nil"/>
-              <w:bottom w:val="nil"/>
-            </w:tcBorders>
+            <w:vMerge/>
             <w:shd w:val="clear" w:color="auto" w:fill="D1D1D1" w:themeFill="background2" w:themeFillShade="E6"/>
           </w:tcPr>
           <w:p>
@@ -5140,10 +5132,7 @@
           <w:tcPr>
             <w:cnfStyle w:val="001000000000" w:firstRow="0" w:lastRow="0" w:firstColumn="1" w:lastColumn="0" w:oddVBand="0" w:evenVBand="0" w:oddHBand="0" w:evenHBand="0" w:firstRowFirstColumn="0" w:firstRowLastColumn="0" w:lastRowFirstColumn="0" w:lastRowLastColumn="0"/>
             <w:tcW w:w="0" w:type="auto"/>
-            <w:tcBorders>
-              <w:top w:val="nil"/>
-              <w:bottom w:val="nil"/>
-            </w:tcBorders>
+            <w:vMerge/>
             <w:shd w:val="clear" w:color="auto" w:fill="D1D1D1" w:themeFill="background2" w:themeFillShade="E6"/>
           </w:tcPr>
           <w:p>
@@ -5183,10 +5172,7 @@
           <w:tcPr>
             <w:cnfStyle w:val="001000000000" w:firstRow="0" w:lastRow="0" w:firstColumn="1" w:lastColumn="0" w:oddVBand="0" w:evenVBand="0" w:oddHBand="0" w:evenHBand="0" w:firstRowFirstColumn="0" w:firstRowLastColumn="0" w:lastRowFirstColumn="0" w:lastRowLastColumn="0"/>
             <w:tcW w:w="0" w:type="auto"/>
-            <w:tcBorders>
-              <w:top w:val="nil"/>
-              <w:bottom w:val="nil"/>
-            </w:tcBorders>
+            <w:vMerge/>
             <w:shd w:val="clear" w:color="auto" w:fill="D1D1D1" w:themeFill="background2" w:themeFillShade="E6"/>
           </w:tcPr>
           <w:p>
@@ -5229,10 +5215,7 @@
           <w:tcPr>
             <w:cnfStyle w:val="001000000000" w:firstRow="0" w:lastRow="0" w:firstColumn="1" w:lastColumn="0" w:oddVBand="0" w:evenVBand="0" w:oddHBand="0" w:evenHBand="0" w:firstRowFirstColumn="0" w:firstRowLastColumn="0" w:lastRowFirstColumn="0" w:lastRowLastColumn="0"/>
             <w:tcW w:w="0" w:type="auto"/>
-            <w:tcBorders>
-              <w:top w:val="nil"/>
-              <w:bottom w:val="nil"/>
-            </w:tcBorders>
+            <w:vMerge/>
             <w:shd w:val="clear" w:color="auto" w:fill="D1D1D1" w:themeFill="background2" w:themeFillShade="E6"/>
           </w:tcPr>
           <w:p>
@@ -5272,10 +5255,7 @@
           <w:tcPr>
             <w:cnfStyle w:val="001000000000" w:firstRow="0" w:lastRow="0" w:firstColumn="1" w:lastColumn="0" w:oddVBand="0" w:evenVBand="0" w:oddHBand="0" w:evenHBand="0" w:firstRowFirstColumn="0" w:firstRowLastColumn="0" w:lastRowFirstColumn="0" w:lastRowLastColumn="0"/>
             <w:tcW w:w="0" w:type="auto"/>
-            <w:tcBorders>
-              <w:top w:val="nil"/>
-              <w:bottom w:val="nil"/>
-            </w:tcBorders>
+            <w:vMerge/>
             <w:shd w:val="clear" w:color="auto" w:fill="D1D1D1" w:themeFill="background2" w:themeFillShade="E6"/>
           </w:tcPr>
           <w:p>
@@ -5318,10 +5298,7 @@
           <w:tcPr>
             <w:cnfStyle w:val="001000000000" w:firstRow="0" w:lastRow="0" w:firstColumn="1" w:lastColumn="0" w:oddVBand="0" w:evenVBand="0" w:oddHBand="0" w:evenHBand="0" w:firstRowFirstColumn="0" w:firstRowLastColumn="0" w:lastRowFirstColumn="0" w:lastRowLastColumn="0"/>
             <w:tcW w:w="0" w:type="auto"/>
-            <w:tcBorders>
-              <w:top w:val="nil"/>
-              <w:bottom w:val="nil"/>
-            </w:tcBorders>
+            <w:vMerge/>
             <w:shd w:val="clear" w:color="auto" w:fill="D1D1D1" w:themeFill="background2" w:themeFillShade="E6"/>
           </w:tcPr>
           <w:p>
@@ -5361,10 +5338,7 @@
           <w:tcPr>
             <w:cnfStyle w:val="001000000000" w:firstRow="0" w:lastRow="0" w:firstColumn="1" w:lastColumn="0" w:oddVBand="0" w:evenVBand="0" w:oddHBand="0" w:evenHBand="0" w:firstRowFirstColumn="0" w:firstRowLastColumn="0" w:lastRowFirstColumn="0" w:lastRowLastColumn="0"/>
             <w:tcW w:w="0" w:type="auto"/>
-            <w:tcBorders>
-              <w:top w:val="nil"/>
-              <w:bottom w:val="single" w:sz="4" w:space="0" w:color="666666" w:themeColor="text1" w:themeTint="99"/>
-            </w:tcBorders>
+            <w:vMerge/>
             <w:shd w:val="clear" w:color="auto" w:fill="D1D1D1" w:themeFill="background2" w:themeFillShade="E6"/>
           </w:tcPr>
           <w:p>
@@ -5407,10 +5381,7 @@
           <w:tcPr>
             <w:cnfStyle w:val="001000000000" w:firstRow="0" w:lastRow="0" w:firstColumn="1" w:lastColumn="0" w:oddVBand="0" w:evenVBand="0" w:oddHBand="0" w:evenHBand="0" w:firstRowFirstColumn="0" w:firstRowLastColumn="0" w:lastRowFirstColumn="0" w:lastRowLastColumn="0"/>
             <w:tcW w:w="0" w:type="auto"/>
-            <w:tcBorders>
-              <w:top w:val="single" w:sz="4" w:space="0" w:color="666666" w:themeColor="text1" w:themeTint="99"/>
-              <w:bottom w:val="nil"/>
-            </w:tcBorders>
+            <w:vMerge/>
             <w:shd w:val="clear" w:color="auto" w:fill="D1D1D1" w:themeFill="background2" w:themeFillShade="E6"/>
           </w:tcPr>
           <w:p>
@@ -5450,10 +5421,7 @@
           <w:tcPr>
             <w:cnfStyle w:val="001000000000" w:firstRow="0" w:lastRow="0" w:firstColumn="1" w:lastColumn="0" w:oddVBand="0" w:evenVBand="0" w:oddHBand="0" w:evenHBand="0" w:firstRowFirstColumn="0" w:firstRowLastColumn="0" w:lastRowFirstColumn="0" w:lastRowLastColumn="0"/>
             <w:tcW w:w="0" w:type="auto"/>
-            <w:tcBorders>
-              <w:top w:val="nil"/>
-              <w:bottom w:val="nil"/>
-            </w:tcBorders>
+            <w:vMerge/>
             <w:shd w:val="clear" w:color="auto" w:fill="D1D1D1" w:themeFill="background2" w:themeFillShade="E6"/>
           </w:tcPr>
           <w:p>
@@ -5496,10 +5464,7 @@
           <w:tcPr>
             <w:cnfStyle w:val="001000000000" w:firstRow="0" w:lastRow="0" w:firstColumn="1" w:lastColumn="0" w:oddVBand="0" w:evenVBand="0" w:oddHBand="0" w:evenHBand="0" w:firstRowFirstColumn="0" w:firstRowLastColumn="0" w:lastRowFirstColumn="0" w:lastRowLastColumn="0"/>
             <w:tcW w:w="0" w:type="auto"/>
-            <w:tcBorders>
-              <w:top w:val="nil"/>
-              <w:bottom w:val="nil"/>
-            </w:tcBorders>
+            <w:vMerge/>
             <w:shd w:val="clear" w:color="auto" w:fill="D1D1D1" w:themeFill="background2" w:themeFillShade="E6"/>
           </w:tcPr>
           <w:p>
@@ -5539,10 +5504,7 @@
           <w:tcPr>
             <w:cnfStyle w:val="001000000000" w:firstRow="0" w:lastRow="0" w:firstColumn="1" w:lastColumn="0" w:oddVBand="0" w:evenVBand="0" w:oddHBand="0" w:evenHBand="0" w:firstRowFirstColumn="0" w:firstRowLastColumn="0" w:lastRowFirstColumn="0" w:lastRowLastColumn="0"/>
             <w:tcW w:w="0" w:type="auto"/>
-            <w:tcBorders>
-              <w:top w:val="nil"/>
-              <w:bottom w:val="nil"/>
-            </w:tcBorders>
+            <w:vMerge/>
             <w:shd w:val="clear" w:color="auto" w:fill="D1D1D1" w:themeFill="background2" w:themeFillShade="E6"/>
           </w:tcPr>
           <w:p>
@@ -5585,10 +5547,7 @@
           <w:tcPr>
             <w:cnfStyle w:val="001000000000" w:firstRow="0" w:lastRow="0" w:firstColumn="1" w:lastColumn="0" w:oddVBand="0" w:evenVBand="0" w:oddHBand="0" w:evenHBand="0" w:firstRowFirstColumn="0" w:firstRowLastColumn="0" w:lastRowFirstColumn="0" w:lastRowLastColumn="0"/>
             <w:tcW w:w="0" w:type="auto"/>
-            <w:tcBorders>
-              <w:top w:val="nil"/>
-              <w:bottom w:val="nil"/>
-            </w:tcBorders>
+            <w:vMerge/>
             <w:shd w:val="clear" w:color="auto" w:fill="D1D1D1" w:themeFill="background2" w:themeFillShade="E6"/>
           </w:tcPr>
           <w:p>
@@ -5628,10 +5587,7 @@
           <w:tcPr>
             <w:cnfStyle w:val="001000000000" w:firstRow="0" w:lastRow="0" w:firstColumn="1" w:lastColumn="0" w:oddVBand="0" w:evenVBand="0" w:oddHBand="0" w:evenHBand="0" w:firstRowFirstColumn="0" w:firstRowLastColumn="0" w:lastRowFirstColumn="0" w:lastRowLastColumn="0"/>
             <w:tcW w:w="0" w:type="auto"/>
-            <w:tcBorders>
-              <w:top w:val="nil"/>
-              <w:bottom w:val="nil"/>
-            </w:tcBorders>
+            <w:vMerge/>
             <w:shd w:val="clear" w:color="auto" w:fill="D1D1D1" w:themeFill="background2" w:themeFillShade="E6"/>
           </w:tcPr>
           <w:p>
@@ -5674,10 +5630,7 @@
           <w:tcPr>
             <w:cnfStyle w:val="001000000000" w:firstRow="0" w:lastRow="0" w:firstColumn="1" w:lastColumn="0" w:oddVBand="0" w:evenVBand="0" w:oddHBand="0" w:evenHBand="0" w:firstRowFirstColumn="0" w:firstRowLastColumn="0" w:lastRowFirstColumn="0" w:lastRowLastColumn="0"/>
             <w:tcW w:w="0" w:type="auto"/>
-            <w:tcBorders>
-              <w:top w:val="nil"/>
-              <w:bottom w:val="nil"/>
-            </w:tcBorders>
+            <w:vMerge/>
             <w:shd w:val="clear" w:color="auto" w:fill="D1D1D1" w:themeFill="background2" w:themeFillShade="E6"/>
           </w:tcPr>
           <w:p>
@@ -5717,10 +5670,7 @@
           <w:tcPr>
             <w:cnfStyle w:val="001000000000" w:firstRow="0" w:lastRow="0" w:firstColumn="1" w:lastColumn="0" w:oddVBand="0" w:evenVBand="0" w:oddHBand="0" w:evenHBand="0" w:firstRowFirstColumn="0" w:firstRowLastColumn="0" w:lastRowFirstColumn="0" w:lastRowLastColumn="0"/>
             <w:tcW w:w="0" w:type="auto"/>
-            <w:tcBorders>
-              <w:top w:val="nil"/>
-              <w:bottom w:val="nil"/>
-            </w:tcBorders>
+            <w:vMerge/>
             <w:shd w:val="clear" w:color="auto" w:fill="D1D1D1" w:themeFill="background2" w:themeFillShade="E6"/>
           </w:tcPr>
           <w:p>
@@ -5763,10 +5713,7 @@
           <w:tcPr>
             <w:cnfStyle w:val="001000000000" w:firstRow="0" w:lastRow="0" w:firstColumn="1" w:lastColumn="0" w:oddVBand="0" w:evenVBand="0" w:oddHBand="0" w:evenHBand="0" w:firstRowFirstColumn="0" w:firstRowLastColumn="0" w:lastRowFirstColumn="0" w:lastRowLastColumn="0"/>
             <w:tcW w:w="0" w:type="auto"/>
-            <w:tcBorders>
-              <w:top w:val="nil"/>
-              <w:bottom w:val="nil"/>
-            </w:tcBorders>
+            <w:vMerge/>
             <w:shd w:val="clear" w:color="auto" w:fill="D1D1D1" w:themeFill="background2" w:themeFillShade="E6"/>
           </w:tcPr>
           <w:p>
@@ -5806,10 +5753,7 @@
           <w:tcPr>
             <w:cnfStyle w:val="001000000000" w:firstRow="0" w:lastRow="0" w:firstColumn="1" w:lastColumn="0" w:oddVBand="0" w:evenVBand="0" w:oddHBand="0" w:evenHBand="0" w:firstRowFirstColumn="0" w:firstRowLastColumn="0" w:lastRowFirstColumn="0" w:lastRowLastColumn="0"/>
             <w:tcW w:w="0" w:type="auto"/>
-            <w:tcBorders>
-              <w:top w:val="nil"/>
-              <w:bottom w:val="nil"/>
-            </w:tcBorders>
+            <w:vMerge/>
             <w:shd w:val="clear" w:color="auto" w:fill="D1D1D1" w:themeFill="background2" w:themeFillShade="E6"/>
           </w:tcPr>
           <w:p>
@@ -5852,10 +5796,7 @@
           <w:tcPr>
             <w:cnfStyle w:val="001000000000" w:firstRow="0" w:lastRow="0" w:firstColumn="1" w:lastColumn="0" w:oddVBand="0" w:evenVBand="0" w:oddHBand="0" w:evenHBand="0" w:firstRowFirstColumn="0" w:firstRowLastColumn="0" w:lastRowFirstColumn="0" w:lastRowLastColumn="0"/>
             <w:tcW w:w="0" w:type="auto"/>
-            <w:tcBorders>
-              <w:top w:val="nil"/>
-              <w:bottom w:val="nil"/>
-            </w:tcBorders>
+            <w:vMerge/>
             <w:shd w:val="clear" w:color="auto" w:fill="D1D1D1" w:themeFill="background2" w:themeFillShade="E6"/>
           </w:tcPr>
           <w:p>
@@ -5895,10 +5836,7 @@
           <w:tcPr>
             <w:cnfStyle w:val="001000000000" w:firstRow="0" w:lastRow="0" w:firstColumn="1" w:lastColumn="0" w:oddVBand="0" w:evenVBand="0" w:oddHBand="0" w:evenHBand="0" w:firstRowFirstColumn="0" w:firstRowLastColumn="0" w:lastRowFirstColumn="0" w:lastRowLastColumn="0"/>
             <w:tcW w:w="0" w:type="auto"/>
-            <w:tcBorders>
-              <w:top w:val="nil"/>
-              <w:bottom w:val="nil"/>
-            </w:tcBorders>
+            <w:vMerge/>
             <w:shd w:val="clear" w:color="auto" w:fill="D1D1D1" w:themeFill="background2" w:themeFillShade="E6"/>
           </w:tcPr>
           <w:p>
@@ -5941,10 +5879,7 @@
           <w:tcPr>
             <w:cnfStyle w:val="001000000000" w:firstRow="0" w:lastRow="0" w:firstColumn="1" w:lastColumn="0" w:oddVBand="0" w:evenVBand="0" w:oddHBand="0" w:evenHBand="0" w:firstRowFirstColumn="0" w:firstRowLastColumn="0" w:lastRowFirstColumn="0" w:lastRowLastColumn="0"/>
             <w:tcW w:w="0" w:type="auto"/>
-            <w:tcBorders>
-              <w:top w:val="nil"/>
-              <w:bottom w:val="nil"/>
-            </w:tcBorders>
+            <w:vMerge/>
             <w:shd w:val="clear" w:color="auto" w:fill="D1D1D1" w:themeFill="background2" w:themeFillShade="E6"/>
           </w:tcPr>
           <w:p>
@@ -5984,9 +5919,7 @@
           <w:tcPr>
             <w:cnfStyle w:val="001000000000" w:firstRow="0" w:lastRow="0" w:firstColumn="1" w:lastColumn="0" w:oddVBand="0" w:evenVBand="0" w:oddHBand="0" w:evenHBand="0" w:firstRowFirstColumn="0" w:firstRowLastColumn="0" w:lastRowFirstColumn="0" w:lastRowLastColumn="0"/>
             <w:tcW w:w="0" w:type="auto"/>
-            <w:tcBorders>
-              <w:top w:val="nil"/>
-            </w:tcBorders>
+            <w:vMerge/>
             <w:shd w:val="clear" w:color="auto" w:fill="D1D1D1" w:themeFill="background2" w:themeFillShade="E6"/>
           </w:tcPr>
           <w:p>
@@ -6029,6 +5962,7 @@
           <w:tcPr>
             <w:cnfStyle w:val="001000000000" w:firstRow="0" w:lastRow="0" w:firstColumn="1" w:lastColumn="0" w:oddVBand="0" w:evenVBand="0" w:oddHBand="0" w:evenHBand="0" w:firstRowFirstColumn="0" w:firstRowLastColumn="0" w:lastRowFirstColumn="0" w:lastRowLastColumn="0"/>
             <w:tcW w:w="0" w:type="auto"/>
+            <w:shd w:val="clear" w:color="auto" w:fill="auto"/>
             <w:hideMark/>
           </w:tcPr>
           <w:p>
@@ -6050,6 +5984,7 @@
         <w:tc>
           <w:tcPr>
             <w:tcW w:w="0" w:type="auto"/>
+            <w:shd w:val="clear" w:color="auto" w:fill="auto"/>
             <w:hideMark/>
           </w:tcPr>
           <w:p>
@@ -6068,6 +6003,7 @@
           <w:tcPr>
             <w:cnfStyle w:val="001000000000" w:firstRow="0" w:lastRow="0" w:firstColumn="1" w:lastColumn="0" w:oddVBand="0" w:evenVBand="0" w:oddHBand="0" w:evenHBand="0" w:firstRowFirstColumn="0" w:firstRowLastColumn="0" w:lastRowFirstColumn="0" w:lastRowLastColumn="0"/>
             <w:tcW w:w="0" w:type="auto"/>
+            <w:shd w:val="clear" w:color="auto" w:fill="CCCCCC"/>
             <w:hideMark/>
           </w:tcPr>
           <w:p>
@@ -6089,6 +6025,7 @@
         <w:tc>
           <w:tcPr>
             <w:tcW w:w="0" w:type="auto"/>
+            <w:shd w:val="clear" w:color="auto" w:fill="CCCCCC"/>
             <w:hideMark/>
           </w:tcPr>
           <w:p>
@@ -6212,6 +6149,10 @@
       </w:r>
     </w:p>
     <w:p>
+      <w:pPr>
+        <w:keepNext/>
+        <w:spacing w:before="240" w:line="278" w:lineRule="auto"/>
+      </w:pPr>
       <w:r>
         <w:rPr>
           <w:rFonts w:ascii="Arial" w:eastAsia="Times New Roman" w:hAnsi="Arial" w:cs="Arial"/>
@@ -6647,9 +6588,6 @@
             <w:cnfStyle w:val="001000000000" w:firstRow="0" w:lastRow="0" w:firstColumn="1" w:lastColumn="0" w:oddVBand="0" w:evenVBand="0" w:oddHBand="0" w:evenHBand="0" w:firstRowFirstColumn="0" w:firstRowLastColumn="0" w:lastRowFirstColumn="0" w:lastRowLastColumn="0"/>
             <w:tcW w:w="0" w:type="auto"/>
             <w:vMerge/>
-            <w:tcBorders>
-              <w:bottom w:val="nil"/>
-            </w:tcBorders>
           </w:tcPr>
           <w:p>
             <w:pPr>
@@ -6688,10 +6626,7 @@
           <w:tcPr>
             <w:cnfStyle w:val="001000000000" w:firstRow="0" w:lastRow="0" w:firstColumn="1" w:lastColumn="0" w:oddVBand="0" w:evenVBand="0" w:oddHBand="0" w:evenHBand="0" w:firstRowFirstColumn="0" w:firstRowLastColumn="0" w:lastRowFirstColumn="0" w:lastRowLastColumn="0"/>
             <w:tcW w:w="0" w:type="auto"/>
-            <w:tcBorders>
-              <w:top w:val="nil"/>
-              <w:bottom w:val="nil"/>
-            </w:tcBorders>
+            <w:vMerge/>
             <w:shd w:val="clear" w:color="auto" w:fill="D1D1D1" w:themeFill="background2" w:themeFillShade="E6"/>
           </w:tcPr>
           <w:p>
@@ -6734,10 +6669,7 @@
           <w:tcPr>
             <w:cnfStyle w:val="001000000000" w:firstRow="0" w:lastRow="0" w:firstColumn="1" w:lastColumn="0" w:oddVBand="0" w:evenVBand="0" w:oddHBand="0" w:evenHBand="0" w:firstRowFirstColumn="0" w:firstRowLastColumn="0" w:lastRowFirstColumn="0" w:lastRowLastColumn="0"/>
             <w:tcW w:w="0" w:type="auto"/>
-            <w:tcBorders>
-              <w:top w:val="nil"/>
-              <w:bottom w:val="nil"/>
-            </w:tcBorders>
+            <w:vMerge/>
             <w:shd w:val="clear" w:color="auto" w:fill="D1D1D1" w:themeFill="background2" w:themeFillShade="E6"/>
           </w:tcPr>
           <w:p>
@@ -6777,10 +6709,7 @@
           <w:tcPr>
             <w:cnfStyle w:val="001000000000" w:firstRow="0" w:lastRow="0" w:firstColumn="1" w:lastColumn="0" w:oddVBand="0" w:evenVBand="0" w:oddHBand="0" w:evenHBand="0" w:firstRowFirstColumn="0" w:firstRowLastColumn="0" w:lastRowFirstColumn="0" w:lastRowLastColumn="0"/>
             <w:tcW w:w="0" w:type="auto"/>
-            <w:tcBorders>
-              <w:top w:val="nil"/>
-              <w:bottom w:val="nil"/>
-            </w:tcBorders>
+            <w:vMerge/>
             <w:shd w:val="clear" w:color="auto" w:fill="D1D1D1" w:themeFill="background2" w:themeFillShade="E6"/>
           </w:tcPr>
           <w:p>
@@ -6823,10 +6752,7 @@
           <w:tcPr>
             <w:cnfStyle w:val="001000000000" w:firstRow="0" w:lastRow="0" w:firstColumn="1" w:lastColumn="0" w:oddVBand="0" w:evenVBand="0" w:oddHBand="0" w:evenHBand="0" w:firstRowFirstColumn="0" w:firstRowLastColumn="0" w:lastRowFirstColumn="0" w:lastRowLastColumn="0"/>
             <w:tcW w:w="0" w:type="auto"/>
-            <w:tcBorders>
-              <w:top w:val="nil"/>
-              <w:bottom w:val="nil"/>
-            </w:tcBorders>
+            <w:vMerge/>
             <w:shd w:val="clear" w:color="auto" w:fill="D1D1D1" w:themeFill="background2" w:themeFillShade="E6"/>
           </w:tcPr>
           <w:p>
@@ -6866,10 +6792,7 @@
           <w:tcPr>
             <w:cnfStyle w:val="001000000000" w:firstRow="0" w:lastRow="0" w:firstColumn="1" w:lastColumn="0" w:oddVBand="0" w:evenVBand="0" w:oddHBand="0" w:evenHBand="0" w:firstRowFirstColumn="0" w:firstRowLastColumn="0" w:lastRowFirstColumn="0" w:lastRowLastColumn="0"/>
             <w:tcW w:w="0" w:type="auto"/>
-            <w:tcBorders>
-              <w:top w:val="nil"/>
-              <w:bottom w:val="nil"/>
-            </w:tcBorders>
+            <w:vMerge/>
             <w:shd w:val="clear" w:color="auto" w:fill="D1D1D1" w:themeFill="background2" w:themeFillShade="E6"/>
           </w:tcPr>
           <w:p>
@@ -6912,10 +6835,7 @@
           <w:tcPr>
             <w:cnfStyle w:val="001000000000" w:firstRow="0" w:lastRow="0" w:firstColumn="1" w:lastColumn="0" w:oddVBand="0" w:evenVBand="0" w:oddHBand="0" w:evenHBand="0" w:firstRowFirstColumn="0" w:firstRowLastColumn="0" w:lastRowFirstColumn="0" w:lastRowLastColumn="0"/>
             <w:tcW w:w="0" w:type="auto"/>
-            <w:tcBorders>
-              <w:top w:val="nil"/>
-              <w:bottom w:val="nil"/>
-            </w:tcBorders>
+            <w:vMerge/>
             <w:shd w:val="clear" w:color="auto" w:fill="D1D1D1" w:themeFill="background2" w:themeFillShade="E6"/>
           </w:tcPr>
           <w:p>
@@ -6955,10 +6875,7 @@
           <w:tcPr>
             <w:cnfStyle w:val="001000000000" w:firstRow="0" w:lastRow="0" w:firstColumn="1" w:lastColumn="0" w:oddVBand="0" w:evenVBand="0" w:oddHBand="0" w:evenHBand="0" w:firstRowFirstColumn="0" w:firstRowLastColumn="0" w:lastRowFirstColumn="0" w:lastRowLastColumn="0"/>
             <w:tcW w:w="0" w:type="auto"/>
-            <w:tcBorders>
-              <w:top w:val="nil"/>
-              <w:bottom w:val="nil"/>
-            </w:tcBorders>
+            <w:vMerge/>
             <w:shd w:val="clear" w:color="auto" w:fill="D1D1D1" w:themeFill="background2" w:themeFillShade="E6"/>
           </w:tcPr>
           <w:p>
@@ -7001,8 +6918,8 @@
           <w:tcPr>
             <w:cnfStyle w:val="001000000000" w:firstRow="0" w:lastRow="0" w:firstColumn="1" w:lastColumn="0" w:oddVBand="0" w:evenVBand="0" w:oddHBand="0" w:evenHBand="0" w:firstRowFirstColumn="0" w:firstRowLastColumn="0" w:lastRowFirstColumn="0" w:lastRowLastColumn="0"/>
             <w:tcW w:w="0" w:type="auto"/>
+            <w:vMerge/>
             <w:tcBorders>
-              <w:top w:val="nil"/>
               <w:bottom w:val="single" w:sz="4" w:space="0" w:color="666666" w:themeColor="text1" w:themeTint="99"/>
             </w:tcBorders>
             <w:shd w:val="clear" w:color="auto" w:fill="D1D1D1" w:themeFill="background2" w:themeFillShade="E6"/>
@@ -7873,6 +7790,10 @@
       </w:pPr>
     </w:p>
     <w:p>
+      <w:pPr>
+        <w:keepNext/>
+        <w:spacing w:before="240" w:line="278" w:lineRule="auto"/>
+      </w:pPr>
       <w:r>
         <w:rPr>
           <w:rFonts w:ascii="Arial" w:eastAsia="Times New Roman" w:hAnsi="Arial" w:cs="Arial"/>
@@ -8245,9 +8166,6 @@
             <w:cnfStyle w:val="001000000000" w:firstRow="0" w:lastRow="0" w:firstColumn="1" w:lastColumn="0" w:oddVBand="0" w:evenVBand="0" w:oddHBand="0" w:evenHBand="0" w:firstRowFirstColumn="0" w:firstRowLastColumn="0" w:lastRowFirstColumn="0" w:lastRowLastColumn="0"/>
             <w:tcW w:w="0" w:type="auto"/>
             <w:vMerge/>
-            <w:tcBorders>
-              <w:bottom w:val="nil"/>
-            </w:tcBorders>
           </w:tcPr>
           <w:p>
             <w:pPr>
@@ -8286,10 +8204,7 @@
           <w:tcPr>
             <w:cnfStyle w:val="001000000000" w:firstRow="0" w:lastRow="0" w:firstColumn="1" w:lastColumn="0" w:oddVBand="0" w:evenVBand="0" w:oddHBand="0" w:evenHBand="0" w:firstRowFirstColumn="0" w:firstRowLastColumn="0" w:lastRowFirstColumn="0" w:lastRowLastColumn="0"/>
             <w:tcW w:w="0" w:type="auto"/>
-            <w:tcBorders>
-              <w:top w:val="nil"/>
-              <w:bottom w:val="nil"/>
-            </w:tcBorders>
+            <w:vMerge/>
             <w:shd w:val="clear" w:color="auto" w:fill="D1D1D1" w:themeFill="background2" w:themeFillShade="E6"/>
           </w:tcPr>
           <w:p>
@@ -8332,9 +8247,7 @@
           <w:tcPr>
             <w:cnfStyle w:val="001000000000" w:firstRow="0" w:lastRow="0" w:firstColumn="1" w:lastColumn="0" w:oddVBand="0" w:evenVBand="0" w:oddHBand="0" w:evenHBand="0" w:firstRowFirstColumn="0" w:firstRowLastColumn="0" w:lastRowFirstColumn="0" w:lastRowLastColumn="0"/>
             <w:tcW w:w="0" w:type="auto"/>
-            <w:tcBorders>
-              <w:top w:val="nil"/>
-            </w:tcBorders>
+            <w:vMerge/>
           </w:tcPr>
           <w:p>
             <w:pPr>
@@ -8435,6 +8348,7 @@
                 <w:rFonts w:ascii="Arial" w:eastAsia="Times New Roman" w:hAnsi="Arial" w:cs="Arial"/>
                 <w:sz w:val="22"/>
               </w:rPr>
+              <w:lastRenderedPageBreak/>
               <w:t>Viewpoint</w:t>
             </w:r>
           </w:p>
@@ -8561,6 +8475,10 @@
       </w:r>
     </w:p>
     <w:p>
+      <w:pPr>
+        <w:keepNext/>
+        <w:spacing w:before="240" w:line="278" w:lineRule="auto"/>
+      </w:pPr>
       <w:r>
         <w:rPr>
           <w:rFonts w:ascii="Arial" w:eastAsia="Times New Roman" w:hAnsi="Arial" w:cs="Arial"/>
@@ -10113,6 +10031,16 @@
       </w:r>
     </w:p>
     <w:p>
+      <w:pPr>
+        <w:keepNext/>
+        <w:spacing w:before="240" w:line="278" w:lineRule="auto"/>
+        <w:rPr>
+          <w:rFonts w:ascii="Arial" w:eastAsia="Times New Roman" w:hAnsi="Arial" w:cs="Arial"/>
+          <w:b/>
+          <w:bCs/>
+          <w:lang w:eastAsia="en-US"/>
+        </w:rPr>
+      </w:pPr>
       <w:r>
         <w:rPr>
           <w:rFonts w:ascii="Arial" w:eastAsia="Times New Roman" w:hAnsi="Arial" w:cs="Arial"/>
@@ -10485,6 +10413,369 @@
             <w:cnfStyle w:val="001000000000" w:firstRow="0" w:lastRow="0" w:firstColumn="1" w:lastColumn="0" w:oddVBand="0" w:evenVBand="0" w:oddHBand="0" w:evenHBand="0" w:firstRowFirstColumn="0" w:firstRowLastColumn="0" w:lastRowFirstColumn="0" w:lastRowLastColumn="0"/>
             <w:tcW w:w="0" w:type="auto"/>
             <w:vMerge/>
+          </w:tcPr>
+          <w:p>
+            <w:pPr>
+              <w:rPr>
+                <w:rFonts w:ascii="Arial" w:eastAsia="Times New Roman" w:hAnsi="Arial" w:cs="Arial"/>
+                <w:sz w:val="22"/>
+              </w:rPr>
+            </w:pPr>
+          </w:p>
+        </w:tc>
+        <w:tc>
+          <w:tcPr>
+            <w:tcW w:w="0" w:type="auto"/>
+            <w:shd w:val="clear" w:color="auto" w:fill="CCCCCC"/>
+          </w:tcPr>
+          <w:p>
+            <w:pPr>
+              <w:cnfStyle w:val="000000100000" w:firstRow="0" w:lastRow="0" w:firstColumn="0" w:lastColumn="0" w:oddVBand="0" w:evenVBand="0" w:oddHBand="1" w:evenHBand="0" w:firstRowFirstColumn="0" w:firstRowLastColumn="0" w:lastRowFirstColumn="0" w:lastRowLastColumn="0"/>
+              <w:rPr>
+                <w:rFonts w:ascii="Arial" w:eastAsia="Times New Roman" w:hAnsi="Arial" w:cs="Arial"/>
+                <w:sz w:val="22"/>
+              </w:rPr>
+            </w:pPr>
+            <w:r>
+              <w:rPr>
+                <w:rFonts w:ascii="Arial" w:eastAsia="Times New Roman" w:hAnsi="Arial" w:cs="Arial"/>
+                <w:sz w:val="22"/>
+              </w:rPr>
+              <w:t>Candidate Search</w:t>
+            </w:r>
+          </w:p>
+        </w:tc>
+      </w:tr>
+      <w:tr>
+        <w:tc>
+          <w:tcPr>
+            <w:cnfStyle w:val="001000000000" w:firstRow="0" w:lastRow="0" w:firstColumn="1" w:lastColumn="0" w:oddVBand="0" w:evenVBand="0" w:oddHBand="0" w:evenHBand="0" w:firstRowFirstColumn="0" w:firstRowLastColumn="0" w:lastRowFirstColumn="0" w:lastRowLastColumn="0"/>
+            <w:tcW w:w="0" w:type="auto"/>
+            <w:vMerge/>
+          </w:tcPr>
+          <w:p>
+            <w:pPr>
+              <w:rPr>
+                <w:rFonts w:ascii="Arial" w:eastAsia="Times New Roman" w:hAnsi="Arial" w:cs="Arial"/>
+                <w:sz w:val="22"/>
+              </w:rPr>
+            </w:pPr>
+          </w:p>
+        </w:tc>
+        <w:tc>
+          <w:tcPr>
+            <w:tcW w:w="0" w:type="auto"/>
+            <w:shd w:val="clear" w:color="auto" w:fill="CCCCCC"/>
+          </w:tcPr>
+          <w:p>
+            <w:pPr>
+              <w:cnfStyle w:val="000000000000" w:firstRow="0" w:lastRow="0" w:firstColumn="0" w:lastColumn="0" w:oddVBand="0" w:evenVBand="0" w:oddHBand="0" w:evenHBand="0" w:firstRowFirstColumn="0" w:firstRowLastColumn="0" w:lastRowFirstColumn="0" w:lastRowLastColumn="0"/>
+              <w:rPr>
+                <w:rFonts w:ascii="Arial" w:eastAsia="Times New Roman" w:hAnsi="Arial" w:cs="Arial"/>
+                <w:sz w:val="22"/>
+              </w:rPr>
+            </w:pPr>
+            <w:r>
+              <w:rPr>
+                <w:rFonts w:ascii="Arial" w:eastAsia="Times New Roman" w:hAnsi="Arial" w:cs="Arial"/>
+                <w:sz w:val="22"/>
+              </w:rPr>
+              <w:t>Wildcard Search</w:t>
+            </w:r>
+          </w:p>
+        </w:tc>
+      </w:tr>
+      <w:tr>
+        <w:trPr>
+          <w:cnfStyle w:val="000000100000" w:firstRow="0" w:lastRow="0" w:firstColumn="0" w:lastColumn="0" w:oddVBand="0" w:evenVBand="0" w:oddHBand="1" w:evenHBand="0" w:firstRowFirstColumn="0" w:firstRowLastColumn="0" w:lastRowFirstColumn="0" w:lastRowLastColumn="0"/>
+        </w:trPr>
+        <w:tc>
+          <w:tcPr>
+            <w:cnfStyle w:val="001000000000" w:firstRow="0" w:lastRow="0" w:firstColumn="1" w:lastColumn="0" w:oddVBand="0" w:evenVBand="0" w:oddHBand="0" w:evenHBand="0" w:firstRowFirstColumn="0" w:firstRowLastColumn="0" w:lastRowFirstColumn="0" w:lastRowLastColumn="0"/>
+            <w:tcW w:w="0" w:type="auto"/>
+            <w:vMerge/>
+          </w:tcPr>
+          <w:p>
+            <w:pPr>
+              <w:rPr>
+                <w:rFonts w:ascii="Arial" w:eastAsia="Times New Roman" w:hAnsi="Arial" w:cs="Arial"/>
+                <w:sz w:val="22"/>
+              </w:rPr>
+            </w:pPr>
+          </w:p>
+        </w:tc>
+        <w:tc>
+          <w:tcPr>
+            <w:tcW w:w="0" w:type="auto"/>
+            <w:shd w:val="clear" w:color="auto" w:fill="CCCCCC"/>
+          </w:tcPr>
+          <w:p>
+            <w:pPr>
+              <w:cnfStyle w:val="000000100000" w:firstRow="0" w:lastRow="0" w:firstColumn="0" w:lastColumn="0" w:oddVBand="0" w:evenVBand="0" w:oddHBand="1" w:evenHBand="0" w:firstRowFirstColumn="0" w:firstRowLastColumn="0" w:lastRowFirstColumn="0" w:lastRowLastColumn="0"/>
+              <w:rPr>
+                <w:rFonts w:ascii="Arial" w:eastAsia="Times New Roman" w:hAnsi="Arial" w:cs="Arial"/>
+                <w:sz w:val="22"/>
+              </w:rPr>
+            </w:pPr>
+            <w:r>
+              <w:rPr>
+                <w:rFonts w:ascii="Arial" w:eastAsia="Times New Roman" w:hAnsi="Arial" w:cs="Arial"/>
+                <w:sz w:val="22"/>
+              </w:rPr>
+              <w:t>Job Search</w:t>
+            </w:r>
+          </w:p>
+        </w:tc>
+      </w:tr>
+      <w:tr>
+        <w:tc>
+          <w:tcPr>
+            <w:cnfStyle w:val="001000000000" w:firstRow="0" w:lastRow="0" w:firstColumn="1" w:lastColumn="0" w:oddVBand="0" w:evenVBand="0" w:oddHBand="0" w:evenHBand="0" w:firstRowFirstColumn="0" w:firstRowLastColumn="0" w:lastRowFirstColumn="0" w:lastRowLastColumn="0"/>
+            <w:tcW w:w="0" w:type="auto"/>
+            <w:vMerge/>
+          </w:tcPr>
+          <w:p>
+            <w:pPr>
+              <w:rPr>
+                <w:rFonts w:ascii="Arial" w:eastAsia="Times New Roman" w:hAnsi="Arial" w:cs="Arial"/>
+                <w:sz w:val="22"/>
+              </w:rPr>
+            </w:pPr>
+          </w:p>
+        </w:tc>
+        <w:tc>
+          <w:tcPr>
+            <w:tcW w:w="0" w:type="auto"/>
+            <w:shd w:val="clear" w:color="auto" w:fill="CCCCCC"/>
+          </w:tcPr>
+          <w:p>
+            <w:pPr>
+              <w:cnfStyle w:val="000000000000" w:firstRow="0" w:lastRow="0" w:firstColumn="0" w:lastColumn="0" w:oddVBand="0" w:evenVBand="0" w:oddHBand="0" w:evenHBand="0" w:firstRowFirstColumn="0" w:firstRowLastColumn="0" w:lastRowFirstColumn="0" w:lastRowLastColumn="0"/>
+              <w:rPr>
+                <w:rFonts w:ascii="Arial" w:eastAsia="Times New Roman" w:hAnsi="Arial" w:cs="Arial"/>
+                <w:sz w:val="22"/>
+              </w:rPr>
+            </w:pPr>
+            <w:r>
+              <w:rPr>
+                <w:rFonts w:ascii="Arial" w:eastAsia="Times New Roman" w:hAnsi="Arial" w:cs="Arial"/>
+                <w:sz w:val="22"/>
+              </w:rPr>
+              <w:t>Search Cache</w:t>
+            </w:r>
+          </w:p>
+        </w:tc>
+      </w:tr>
+      <w:tr>
+        <w:trPr>
+          <w:cnfStyle w:val="000000100000" w:firstRow="0" w:lastRow="0" w:firstColumn="0" w:lastColumn="0" w:oddVBand="0" w:evenVBand="0" w:oddHBand="1" w:evenHBand="0" w:firstRowFirstColumn="0" w:firstRowLastColumn="0" w:lastRowFirstColumn="0" w:lastRowLastColumn="0"/>
+        </w:trPr>
+        <w:tc>
+          <w:tcPr>
+            <w:cnfStyle w:val="001000000000" w:firstRow="0" w:lastRow="0" w:firstColumn="1" w:lastColumn="0" w:oddVBand="0" w:evenVBand="0" w:oddHBand="0" w:evenHBand="0" w:firstRowFirstColumn="0" w:firstRowLastColumn="0" w:lastRowFirstColumn="0" w:lastRowLastColumn="0"/>
+            <w:tcW w:w="0" w:type="auto"/>
+            <w:vMerge/>
+          </w:tcPr>
+          <w:p>
+            <w:pPr>
+              <w:rPr>
+                <w:rFonts w:ascii="Arial" w:eastAsia="Times New Roman" w:hAnsi="Arial" w:cs="Arial"/>
+                <w:sz w:val="22"/>
+              </w:rPr>
+            </w:pPr>
+          </w:p>
+        </w:tc>
+        <w:tc>
+          <w:tcPr>
+            <w:tcW w:w="0" w:type="auto"/>
+            <w:shd w:val="clear" w:color="auto" w:fill="CCCCCC"/>
+          </w:tcPr>
+          <w:p>
+            <w:pPr>
+              <w:cnfStyle w:val="000000100000" w:firstRow="0" w:lastRow="0" w:firstColumn="0" w:lastColumn="0" w:oddVBand="0" w:evenVBand="0" w:oddHBand="1" w:evenHBand="0" w:firstRowFirstColumn="0" w:firstRowLastColumn="0" w:lastRowFirstColumn="0" w:lastRowLastColumn="0"/>
+              <w:rPr>
+                <w:rFonts w:ascii="Arial" w:eastAsia="Times New Roman" w:hAnsi="Arial" w:cs="Arial"/>
+                <w:sz w:val="22"/>
+              </w:rPr>
+            </w:pPr>
+            <w:r>
+              <w:rPr>
+                <w:rFonts w:ascii="Arial" w:eastAsia="Times New Roman" w:hAnsi="Arial" w:cs="Arial"/>
+                <w:sz w:val="22"/>
+              </w:rPr>
+              <w:t>Company Search</w:t>
+            </w:r>
+          </w:p>
+        </w:tc>
+      </w:tr>
+      <w:tr>
+        <w:tc>
+          <w:tcPr>
+            <w:cnfStyle w:val="001000000000" w:firstRow="0" w:lastRow="0" w:firstColumn="1" w:lastColumn="0" w:oddVBand="0" w:evenVBand="0" w:oddHBand="0" w:evenHBand="0" w:firstRowFirstColumn="0" w:firstRowLastColumn="0" w:lastRowFirstColumn="0" w:lastRowLastColumn="0"/>
+            <w:tcW w:w="0" w:type="auto"/>
+            <w:vMerge/>
+          </w:tcPr>
+          <w:p>
+            <w:pPr>
+              <w:rPr>
+                <w:rFonts w:ascii="Arial" w:eastAsia="Times New Roman" w:hAnsi="Arial" w:cs="Arial"/>
+                <w:sz w:val="22"/>
+              </w:rPr>
+            </w:pPr>
+          </w:p>
+        </w:tc>
+        <w:tc>
+          <w:tcPr>
+            <w:tcW w:w="0" w:type="auto"/>
+            <w:shd w:val="clear" w:color="auto" w:fill="CCCCCC"/>
+          </w:tcPr>
+          <w:p>
+            <w:pPr>
+              <w:cnfStyle w:val="000000000000" w:firstRow="0" w:lastRow="0" w:firstColumn="0" w:lastColumn="0" w:oddVBand="0" w:evenVBand="0" w:oddHBand="0" w:evenHBand="0" w:firstRowFirstColumn="0" w:firstRowLastColumn="0" w:lastRowFirstColumn="0" w:lastRowLastColumn="0"/>
+              <w:rPr>
+                <w:rFonts w:ascii="Arial" w:eastAsia="Times New Roman" w:hAnsi="Arial" w:cs="Arial"/>
+                <w:sz w:val="22"/>
+              </w:rPr>
+            </w:pPr>
+            <w:r>
+              <w:rPr>
+                <w:rFonts w:ascii="Arial" w:eastAsia="Times New Roman" w:hAnsi="Arial" w:cs="Arial"/>
+                <w:sz w:val="22"/>
+              </w:rPr>
+              <w:t>Filter Processor</w:t>
+            </w:r>
+          </w:p>
+        </w:tc>
+      </w:tr>
+      <w:tr>
+        <w:trPr>
+          <w:cnfStyle w:val="000000100000" w:firstRow="0" w:lastRow="0" w:firstColumn="0" w:lastColumn="0" w:oddVBand="0" w:evenVBand="0" w:oddHBand="1" w:evenHBand="0" w:firstRowFirstColumn="0" w:firstRowLastColumn="0" w:lastRowFirstColumn="0" w:lastRowLastColumn="0"/>
+        </w:trPr>
+        <w:tc>
+          <w:tcPr>
+            <w:cnfStyle w:val="001000000000" w:firstRow="0" w:lastRow="0" w:firstColumn="1" w:lastColumn="0" w:oddVBand="0" w:evenVBand="0" w:oddHBand="0" w:evenHBand="0" w:firstRowFirstColumn="0" w:firstRowLastColumn="0" w:lastRowFirstColumn="0" w:lastRowLastColumn="0"/>
+            <w:tcW w:w="0" w:type="auto"/>
+            <w:vMerge/>
+          </w:tcPr>
+          <w:p>
+            <w:pPr>
+              <w:rPr>
+                <w:rFonts w:ascii="Arial" w:eastAsia="Times New Roman" w:hAnsi="Arial" w:cs="Arial"/>
+                <w:sz w:val="22"/>
+              </w:rPr>
+            </w:pPr>
+          </w:p>
+        </w:tc>
+        <w:tc>
+          <w:tcPr>
+            <w:tcW w:w="0" w:type="auto"/>
+            <w:shd w:val="clear" w:color="auto" w:fill="CCCCCC"/>
+          </w:tcPr>
+          <w:p>
+            <w:pPr>
+              <w:cnfStyle w:val="000000100000" w:firstRow="0" w:lastRow="0" w:firstColumn="0" w:lastColumn="0" w:oddVBand="0" w:evenVBand="0" w:oddHBand="1" w:evenHBand="0" w:firstRowFirstColumn="0" w:firstRowLastColumn="0" w:lastRowFirstColumn="0" w:lastRowLastColumn="0"/>
+              <w:rPr>
+                <w:rFonts w:ascii="Arial" w:eastAsia="Times New Roman" w:hAnsi="Arial" w:cs="Arial"/>
+                <w:sz w:val="22"/>
+              </w:rPr>
+            </w:pPr>
+            <w:r>
+              <w:rPr>
+                <w:rFonts w:ascii="Arial" w:eastAsia="Times New Roman" w:hAnsi="Arial" w:cs="Arial"/>
+                <w:sz w:val="22"/>
+              </w:rPr>
+              <w:t>Search Engine Adapter</w:t>
+            </w:r>
+          </w:p>
+        </w:tc>
+      </w:tr>
+      <w:tr>
+        <w:tc>
+          <w:tcPr>
+            <w:cnfStyle w:val="001000000000" w:firstRow="0" w:lastRow="0" w:firstColumn="1" w:lastColumn="0" w:oddVBand="0" w:evenVBand="0" w:oddHBand="0" w:evenHBand="0" w:firstRowFirstColumn="0" w:firstRowLastColumn="0" w:lastRowFirstColumn="0" w:lastRowLastColumn="0"/>
+            <w:tcW w:w="0" w:type="auto"/>
+            <w:vMerge/>
+          </w:tcPr>
+          <w:p>
+            <w:pPr>
+              <w:rPr>
+                <w:rFonts w:ascii="Arial" w:eastAsia="Times New Roman" w:hAnsi="Arial" w:cs="Arial"/>
+                <w:sz w:val="22"/>
+              </w:rPr>
+            </w:pPr>
+          </w:p>
+        </w:tc>
+        <w:tc>
+          <w:tcPr>
+            <w:tcW w:w="0" w:type="auto"/>
+            <w:shd w:val="clear" w:color="auto" w:fill="CCCCCC"/>
+          </w:tcPr>
+          <w:p>
+            <w:pPr>
+              <w:cnfStyle w:val="000000000000" w:firstRow="0" w:lastRow="0" w:firstColumn="0" w:lastColumn="0" w:oddVBand="0" w:evenVBand="0" w:oddHBand="0" w:evenHBand="0" w:firstRowFirstColumn="0" w:firstRowLastColumn="0" w:lastRowFirstColumn="0" w:lastRowLastColumn="0"/>
+              <w:rPr>
+                <w:rFonts w:ascii="Arial" w:eastAsia="Times New Roman" w:hAnsi="Arial" w:cs="Arial"/>
+                <w:sz w:val="22"/>
+              </w:rPr>
+            </w:pPr>
+            <w:r>
+              <w:rPr>
+                <w:rFonts w:ascii="Arial" w:eastAsia="Times New Roman" w:hAnsi="Arial" w:cs="Arial"/>
+                <w:sz w:val="22"/>
+              </w:rPr>
+              <w:t>Search Index / Search Engine</w:t>
+            </w:r>
+          </w:p>
+        </w:tc>
+      </w:tr>
+      <w:tr>
+        <w:trPr>
+          <w:cnfStyle w:val="000000100000" w:firstRow="0" w:lastRow="0" w:firstColumn="0" w:lastColumn="0" w:oddVBand="0" w:evenVBand="0" w:oddHBand="1" w:evenHBand="0" w:firstRowFirstColumn="0" w:firstRowLastColumn="0" w:lastRowFirstColumn="0" w:lastRowLastColumn="0"/>
+        </w:trPr>
+        <w:tc>
+          <w:tcPr>
+            <w:cnfStyle w:val="001000000000" w:firstRow="0" w:lastRow="0" w:firstColumn="1" w:lastColumn="0" w:oddVBand="0" w:evenVBand="0" w:oddHBand="0" w:evenHBand="0" w:firstRowFirstColumn="0" w:firstRowLastColumn="0" w:lastRowFirstColumn="0" w:lastRowLastColumn="0"/>
+            <w:tcW w:w="0" w:type="auto"/>
+            <w:vMerge/>
+          </w:tcPr>
+          <w:p>
+            <w:pPr>
+              <w:rPr>
+                <w:rFonts w:ascii="Arial" w:eastAsia="Times New Roman" w:hAnsi="Arial" w:cs="Arial"/>
+                <w:sz w:val="22"/>
+              </w:rPr>
+            </w:pPr>
+          </w:p>
+        </w:tc>
+        <w:tc>
+          <w:tcPr>
+            <w:tcW w:w="0" w:type="auto"/>
+            <w:shd w:val="clear" w:color="auto" w:fill="CCCCCC"/>
+          </w:tcPr>
+          <w:p>
+            <w:pPr>
+              <w:cnfStyle w:val="000000100000" w:firstRow="0" w:lastRow="0" w:firstColumn="0" w:lastColumn="0" w:oddVBand="0" w:evenVBand="0" w:oddHBand="1" w:evenHBand="0" w:firstRowFirstColumn="0" w:firstRowLastColumn="0" w:lastRowFirstColumn="0" w:lastRowLastColumn="0"/>
+              <w:rPr>
+                <w:rFonts w:ascii="Arial" w:eastAsia="Times New Roman" w:hAnsi="Arial" w:cs="Arial"/>
+                <w:sz w:val="22"/>
+              </w:rPr>
+            </w:pPr>
+            <w:r>
+              <w:rPr>
+                <w:rFonts w:ascii="Arial" w:eastAsia="Times New Roman" w:hAnsi="Arial" w:cs="Arial"/>
+                <w:sz w:val="22"/>
+              </w:rPr>
+              <w:t>Autocomplete Component</w:t>
+            </w:r>
+          </w:p>
+        </w:tc>
+      </w:tr>
+      <w:tr>
+        <w:tc>
+          <w:tcPr>
+            <w:cnfStyle w:val="001000000000" w:firstRow="0" w:lastRow="0" w:firstColumn="1" w:lastColumn="0" w:oddVBand="0" w:evenVBand="0" w:oddHBand="0" w:evenHBand="0" w:firstRowFirstColumn="0" w:firstRowLastColumn="0" w:lastRowFirstColumn="0" w:lastRowLastColumn="0"/>
+            <w:tcW w:w="0" w:type="auto"/>
+            <w:vMerge/>
             <w:tcBorders>
               <w:bottom w:val="nil"/>
             </w:tcBorders>
@@ -10505,47 +10796,6 @@
           </w:tcPr>
           <w:p>
             <w:pPr>
-              <w:cnfStyle w:val="000000100000" w:firstRow="0" w:lastRow="0" w:firstColumn="0" w:lastColumn="0" w:oddVBand="0" w:evenVBand="0" w:oddHBand="1" w:evenHBand="0" w:firstRowFirstColumn="0" w:firstRowLastColumn="0" w:lastRowFirstColumn="0" w:lastRowLastColumn="0"/>
-              <w:rPr>
-                <w:rFonts w:ascii="Arial" w:eastAsia="Times New Roman" w:hAnsi="Arial" w:cs="Arial"/>
-                <w:sz w:val="22"/>
-              </w:rPr>
-            </w:pPr>
-            <w:r>
-              <w:rPr>
-                <w:rFonts w:ascii="Arial" w:eastAsia="Times New Roman" w:hAnsi="Arial" w:cs="Arial"/>
-                <w:sz w:val="22"/>
-              </w:rPr>
-              <w:t>Candidate Search</w:t>
-            </w:r>
-          </w:p>
-        </w:tc>
-      </w:tr>
-      <w:tr>
-        <w:tc>
-          <w:tcPr>
-            <w:cnfStyle w:val="001000000000" w:firstRow="0" w:lastRow="0" w:firstColumn="1" w:lastColumn="0" w:oddVBand="0" w:evenVBand="0" w:oddHBand="0" w:evenHBand="0" w:firstRowFirstColumn="0" w:firstRowLastColumn="0" w:lastRowFirstColumn="0" w:lastRowLastColumn="0"/>
-            <w:tcW w:w="0" w:type="auto"/>
-            <w:tcBorders>
-              <w:bottom w:val="nil"/>
-            </w:tcBorders>
-          </w:tcPr>
-          <w:p>
-            <w:pPr>
-              <w:rPr>
-                <w:rFonts w:ascii="Arial" w:eastAsia="Times New Roman" w:hAnsi="Arial" w:cs="Arial"/>
-                <w:sz w:val="22"/>
-              </w:rPr>
-            </w:pPr>
-          </w:p>
-        </w:tc>
-        <w:tc>
-          <w:tcPr>
-            <w:tcW w:w="0" w:type="auto"/>
-            <w:shd w:val="clear" w:color="auto" w:fill="CCCCCC"/>
-          </w:tcPr>
-          <w:p>
-            <w:pPr>
               <w:cnfStyle w:val="000000000000" w:firstRow="0" w:lastRow="0" w:firstColumn="0" w:lastColumn="0" w:oddVBand="0" w:evenVBand="0" w:oddHBand="0" w:evenHBand="0" w:firstRowFirstColumn="0" w:firstRowLastColumn="0" w:lastRowFirstColumn="0" w:lastRowLastColumn="0"/>
               <w:rPr>
                 <w:rFonts w:ascii="Arial" w:eastAsia="Times New Roman" w:hAnsi="Arial" w:cs="Arial"/>
@@ -10557,7 +10807,7 @@
                 <w:rFonts w:ascii="Arial" w:eastAsia="Times New Roman" w:hAnsi="Arial" w:cs="Arial"/>
                 <w:sz w:val="22"/>
               </w:rPr>
-              <w:t>Wildcard Search</w:t>
+              <w:t>Result Ranking</w:t>
             </w:r>
           </w:p>
         </w:tc>
@@ -10571,348 +10821,9 @@
             <w:cnfStyle w:val="001000000000" w:firstRow="0" w:lastRow="0" w:firstColumn="1" w:lastColumn="0" w:oddVBand="0" w:evenVBand="0" w:oddHBand="0" w:evenHBand="0" w:firstRowFirstColumn="0" w:firstRowLastColumn="0" w:lastRowFirstColumn="0" w:lastRowLastColumn="0"/>
             <w:tcW w:w="0" w:type="auto"/>
             <w:tcBorders>
-              <w:bottom w:val="nil"/>
-            </w:tcBorders>
-          </w:tcPr>
-          <w:p>
-            <w:pPr>
-              <w:rPr>
-                <w:rFonts w:ascii="Arial" w:eastAsia="Times New Roman" w:hAnsi="Arial" w:cs="Arial"/>
-                <w:sz w:val="22"/>
-              </w:rPr>
-            </w:pPr>
-          </w:p>
-        </w:tc>
-        <w:tc>
-          <w:tcPr>
-            <w:tcW w:w="0" w:type="auto"/>
-            <w:shd w:val="clear" w:color="auto" w:fill="CCCCCC"/>
-          </w:tcPr>
-          <w:p>
-            <w:pPr>
-              <w:cnfStyle w:val="000000100000" w:firstRow="0" w:lastRow="0" w:firstColumn="0" w:lastColumn="0" w:oddVBand="0" w:evenVBand="0" w:oddHBand="1" w:evenHBand="0" w:firstRowFirstColumn="0" w:firstRowLastColumn="0" w:lastRowFirstColumn="0" w:lastRowLastColumn="0"/>
-              <w:rPr>
-                <w:rFonts w:ascii="Arial" w:eastAsia="Times New Roman" w:hAnsi="Arial" w:cs="Arial"/>
-                <w:sz w:val="22"/>
-              </w:rPr>
-            </w:pPr>
-            <w:r>
-              <w:rPr>
-                <w:rFonts w:ascii="Arial" w:eastAsia="Times New Roman" w:hAnsi="Arial" w:cs="Arial"/>
-                <w:sz w:val="22"/>
-              </w:rPr>
-              <w:t>Job Search</w:t>
-            </w:r>
-          </w:p>
-        </w:tc>
-      </w:tr>
-      <w:tr>
-        <w:tc>
-          <w:tcPr>
-            <w:cnfStyle w:val="001000000000" w:firstRow="0" w:lastRow="0" w:firstColumn="1" w:lastColumn="0" w:oddVBand="0" w:evenVBand="0" w:oddHBand="0" w:evenHBand="0" w:firstRowFirstColumn="0" w:firstRowLastColumn="0" w:lastRowFirstColumn="0" w:lastRowLastColumn="0"/>
-            <w:tcW w:w="0" w:type="auto"/>
-            <w:tcBorders>
-              <w:bottom w:val="nil"/>
-            </w:tcBorders>
-          </w:tcPr>
-          <w:p>
-            <w:pPr>
-              <w:rPr>
-                <w:rFonts w:ascii="Arial" w:eastAsia="Times New Roman" w:hAnsi="Arial" w:cs="Arial"/>
-                <w:sz w:val="22"/>
-              </w:rPr>
-            </w:pPr>
-          </w:p>
-        </w:tc>
-        <w:tc>
-          <w:tcPr>
-            <w:tcW w:w="0" w:type="auto"/>
-            <w:shd w:val="clear" w:color="auto" w:fill="CCCCCC"/>
-          </w:tcPr>
-          <w:p>
-            <w:pPr>
-              <w:cnfStyle w:val="000000000000" w:firstRow="0" w:lastRow="0" w:firstColumn="0" w:lastColumn="0" w:oddVBand="0" w:evenVBand="0" w:oddHBand="0" w:evenHBand="0" w:firstRowFirstColumn="0" w:firstRowLastColumn="0" w:lastRowFirstColumn="0" w:lastRowLastColumn="0"/>
-              <w:rPr>
-                <w:rFonts w:ascii="Arial" w:eastAsia="Times New Roman" w:hAnsi="Arial" w:cs="Arial"/>
-                <w:sz w:val="22"/>
-              </w:rPr>
-            </w:pPr>
-            <w:r>
-              <w:rPr>
-                <w:rFonts w:ascii="Arial" w:eastAsia="Times New Roman" w:hAnsi="Arial" w:cs="Arial"/>
-                <w:sz w:val="22"/>
-              </w:rPr>
-              <w:t>Search Cache</w:t>
-            </w:r>
-          </w:p>
-        </w:tc>
-      </w:tr>
-      <w:tr>
-        <w:trPr>
-          <w:cnfStyle w:val="000000100000" w:firstRow="0" w:lastRow="0" w:firstColumn="0" w:lastColumn="0" w:oddVBand="0" w:evenVBand="0" w:oddHBand="1" w:evenHBand="0" w:firstRowFirstColumn="0" w:firstRowLastColumn="0" w:lastRowFirstColumn="0" w:lastRowLastColumn="0"/>
-        </w:trPr>
-        <w:tc>
-          <w:tcPr>
-            <w:cnfStyle w:val="001000000000" w:firstRow="0" w:lastRow="0" w:firstColumn="1" w:lastColumn="0" w:oddVBand="0" w:evenVBand="0" w:oddHBand="0" w:evenHBand="0" w:firstRowFirstColumn="0" w:firstRowLastColumn="0" w:lastRowFirstColumn="0" w:lastRowLastColumn="0"/>
-            <w:tcW w:w="0" w:type="auto"/>
-            <w:tcBorders>
-              <w:bottom w:val="nil"/>
-            </w:tcBorders>
-          </w:tcPr>
-          <w:p>
-            <w:pPr>
-              <w:rPr>
-                <w:rFonts w:ascii="Arial" w:eastAsia="Times New Roman" w:hAnsi="Arial" w:cs="Arial"/>
-                <w:sz w:val="22"/>
-              </w:rPr>
-            </w:pPr>
-          </w:p>
-        </w:tc>
-        <w:tc>
-          <w:tcPr>
-            <w:tcW w:w="0" w:type="auto"/>
-            <w:shd w:val="clear" w:color="auto" w:fill="CCCCCC"/>
-          </w:tcPr>
-          <w:p>
-            <w:pPr>
-              <w:cnfStyle w:val="000000100000" w:firstRow="0" w:lastRow="0" w:firstColumn="0" w:lastColumn="0" w:oddVBand="0" w:evenVBand="0" w:oddHBand="1" w:evenHBand="0" w:firstRowFirstColumn="0" w:firstRowLastColumn="0" w:lastRowFirstColumn="0" w:lastRowLastColumn="0"/>
-              <w:rPr>
-                <w:rFonts w:ascii="Arial" w:eastAsia="Times New Roman" w:hAnsi="Arial" w:cs="Arial"/>
-                <w:sz w:val="22"/>
-              </w:rPr>
-            </w:pPr>
-            <w:r>
-              <w:rPr>
-                <w:rFonts w:ascii="Arial" w:eastAsia="Times New Roman" w:hAnsi="Arial" w:cs="Arial"/>
-                <w:sz w:val="22"/>
-              </w:rPr>
-              <w:t>Company Search</w:t>
-            </w:r>
-          </w:p>
-        </w:tc>
-      </w:tr>
-      <w:tr>
-        <w:tc>
-          <w:tcPr>
-            <w:cnfStyle w:val="001000000000" w:firstRow="0" w:lastRow="0" w:firstColumn="1" w:lastColumn="0" w:oddVBand="0" w:evenVBand="0" w:oddHBand="0" w:evenHBand="0" w:firstRowFirstColumn="0" w:firstRowLastColumn="0" w:lastRowFirstColumn="0" w:lastRowLastColumn="0"/>
-            <w:tcW w:w="0" w:type="auto"/>
-            <w:tcBorders>
-              <w:bottom w:val="nil"/>
-            </w:tcBorders>
-          </w:tcPr>
-          <w:p>
-            <w:pPr>
-              <w:rPr>
-                <w:rFonts w:ascii="Arial" w:eastAsia="Times New Roman" w:hAnsi="Arial" w:cs="Arial"/>
-                <w:sz w:val="22"/>
-              </w:rPr>
-            </w:pPr>
-          </w:p>
-        </w:tc>
-        <w:tc>
-          <w:tcPr>
-            <w:tcW w:w="0" w:type="auto"/>
-            <w:shd w:val="clear" w:color="auto" w:fill="CCCCCC"/>
-          </w:tcPr>
-          <w:p>
-            <w:pPr>
-              <w:cnfStyle w:val="000000000000" w:firstRow="0" w:lastRow="0" w:firstColumn="0" w:lastColumn="0" w:oddVBand="0" w:evenVBand="0" w:oddHBand="0" w:evenHBand="0" w:firstRowFirstColumn="0" w:firstRowLastColumn="0" w:lastRowFirstColumn="0" w:lastRowLastColumn="0"/>
-              <w:rPr>
-                <w:rFonts w:ascii="Arial" w:eastAsia="Times New Roman" w:hAnsi="Arial" w:cs="Arial"/>
-                <w:sz w:val="22"/>
-              </w:rPr>
-            </w:pPr>
-            <w:r>
-              <w:rPr>
-                <w:rFonts w:ascii="Arial" w:eastAsia="Times New Roman" w:hAnsi="Arial" w:cs="Arial"/>
-                <w:sz w:val="22"/>
-              </w:rPr>
-              <w:t>Filter Processor</w:t>
-            </w:r>
-          </w:p>
-        </w:tc>
-      </w:tr>
-      <w:tr>
-        <w:trPr>
-          <w:cnfStyle w:val="000000100000" w:firstRow="0" w:lastRow="0" w:firstColumn="0" w:lastColumn="0" w:oddVBand="0" w:evenVBand="0" w:oddHBand="1" w:evenHBand="0" w:firstRowFirstColumn="0" w:firstRowLastColumn="0" w:lastRowFirstColumn="0" w:lastRowLastColumn="0"/>
-        </w:trPr>
-        <w:tc>
-          <w:tcPr>
-            <w:cnfStyle w:val="001000000000" w:firstRow="0" w:lastRow="0" w:firstColumn="1" w:lastColumn="0" w:oddVBand="0" w:evenVBand="0" w:oddHBand="0" w:evenHBand="0" w:firstRowFirstColumn="0" w:firstRowLastColumn="0" w:lastRowFirstColumn="0" w:lastRowLastColumn="0"/>
-            <w:tcW w:w="0" w:type="auto"/>
-            <w:tcBorders>
-              <w:bottom w:val="nil"/>
-            </w:tcBorders>
-          </w:tcPr>
-          <w:p>
-            <w:pPr>
-              <w:rPr>
-                <w:rFonts w:ascii="Arial" w:eastAsia="Times New Roman" w:hAnsi="Arial" w:cs="Arial"/>
-                <w:sz w:val="22"/>
-              </w:rPr>
-            </w:pPr>
-          </w:p>
-        </w:tc>
-        <w:tc>
-          <w:tcPr>
-            <w:tcW w:w="0" w:type="auto"/>
-            <w:shd w:val="clear" w:color="auto" w:fill="CCCCCC"/>
-          </w:tcPr>
-          <w:p>
-            <w:pPr>
-              <w:cnfStyle w:val="000000100000" w:firstRow="0" w:lastRow="0" w:firstColumn="0" w:lastColumn="0" w:oddVBand="0" w:evenVBand="0" w:oddHBand="1" w:evenHBand="0" w:firstRowFirstColumn="0" w:firstRowLastColumn="0" w:lastRowFirstColumn="0" w:lastRowLastColumn="0"/>
-              <w:rPr>
-                <w:rFonts w:ascii="Arial" w:eastAsia="Times New Roman" w:hAnsi="Arial" w:cs="Arial"/>
-                <w:sz w:val="22"/>
-              </w:rPr>
-            </w:pPr>
-            <w:r>
-              <w:rPr>
-                <w:rFonts w:ascii="Arial" w:eastAsia="Times New Roman" w:hAnsi="Arial" w:cs="Arial"/>
-                <w:sz w:val="22"/>
-              </w:rPr>
-              <w:t>Search Engine Adapter</w:t>
-            </w:r>
-          </w:p>
-        </w:tc>
-      </w:tr>
-      <w:tr>
-        <w:tc>
-          <w:tcPr>
-            <w:cnfStyle w:val="001000000000" w:firstRow="0" w:lastRow="0" w:firstColumn="1" w:lastColumn="0" w:oddVBand="0" w:evenVBand="0" w:oddHBand="0" w:evenHBand="0" w:firstRowFirstColumn="0" w:firstRowLastColumn="0" w:lastRowFirstColumn="0" w:lastRowLastColumn="0"/>
-            <w:tcW w:w="0" w:type="auto"/>
-            <w:tcBorders>
-              <w:bottom w:val="nil"/>
-            </w:tcBorders>
-          </w:tcPr>
-          <w:p>
-            <w:pPr>
-              <w:rPr>
-                <w:rFonts w:ascii="Arial" w:eastAsia="Times New Roman" w:hAnsi="Arial" w:cs="Arial"/>
-                <w:sz w:val="22"/>
-              </w:rPr>
-            </w:pPr>
-          </w:p>
-        </w:tc>
-        <w:tc>
-          <w:tcPr>
-            <w:tcW w:w="0" w:type="auto"/>
-            <w:shd w:val="clear" w:color="auto" w:fill="CCCCCC"/>
-          </w:tcPr>
-          <w:p>
-            <w:pPr>
-              <w:cnfStyle w:val="000000000000" w:firstRow="0" w:lastRow="0" w:firstColumn="0" w:lastColumn="0" w:oddVBand="0" w:evenVBand="0" w:oddHBand="0" w:evenHBand="0" w:firstRowFirstColumn="0" w:firstRowLastColumn="0" w:lastRowFirstColumn="0" w:lastRowLastColumn="0"/>
-              <w:rPr>
-                <w:rFonts w:ascii="Arial" w:eastAsia="Times New Roman" w:hAnsi="Arial" w:cs="Arial"/>
-                <w:sz w:val="22"/>
-              </w:rPr>
-            </w:pPr>
-            <w:r>
-              <w:rPr>
-                <w:rFonts w:ascii="Arial" w:eastAsia="Times New Roman" w:hAnsi="Arial" w:cs="Arial"/>
-                <w:sz w:val="22"/>
-              </w:rPr>
-              <w:t>Search Index / Search Engine</w:t>
-            </w:r>
-          </w:p>
-        </w:tc>
-      </w:tr>
-      <w:tr>
-        <w:trPr>
-          <w:cnfStyle w:val="000000100000" w:firstRow="0" w:lastRow="0" w:firstColumn="0" w:lastColumn="0" w:oddVBand="0" w:evenVBand="0" w:oddHBand="1" w:evenHBand="0" w:firstRowFirstColumn="0" w:firstRowLastColumn="0" w:lastRowFirstColumn="0" w:lastRowLastColumn="0"/>
-        </w:trPr>
-        <w:tc>
-          <w:tcPr>
-            <w:cnfStyle w:val="001000000000" w:firstRow="0" w:lastRow="0" w:firstColumn="1" w:lastColumn="0" w:oddVBand="0" w:evenVBand="0" w:oddHBand="0" w:evenHBand="0" w:firstRowFirstColumn="0" w:firstRowLastColumn="0" w:lastRowFirstColumn="0" w:lastRowLastColumn="0"/>
-            <w:tcW w:w="0" w:type="auto"/>
-            <w:tcBorders>
-              <w:bottom w:val="nil"/>
-            </w:tcBorders>
-          </w:tcPr>
-          <w:p>
-            <w:pPr>
-              <w:rPr>
-                <w:rFonts w:ascii="Arial" w:eastAsia="Times New Roman" w:hAnsi="Arial" w:cs="Arial"/>
-                <w:sz w:val="22"/>
-              </w:rPr>
-            </w:pPr>
-          </w:p>
-        </w:tc>
-        <w:tc>
-          <w:tcPr>
-            <w:tcW w:w="0" w:type="auto"/>
-            <w:shd w:val="clear" w:color="auto" w:fill="CCCCCC"/>
-          </w:tcPr>
-          <w:p>
-            <w:pPr>
-              <w:cnfStyle w:val="000000100000" w:firstRow="0" w:lastRow="0" w:firstColumn="0" w:lastColumn="0" w:oddVBand="0" w:evenVBand="0" w:oddHBand="1" w:evenHBand="0" w:firstRowFirstColumn="0" w:firstRowLastColumn="0" w:lastRowFirstColumn="0" w:lastRowLastColumn="0"/>
-              <w:rPr>
-                <w:rFonts w:ascii="Arial" w:eastAsia="Times New Roman" w:hAnsi="Arial" w:cs="Arial"/>
-                <w:sz w:val="22"/>
-              </w:rPr>
-            </w:pPr>
-            <w:r>
-              <w:rPr>
-                <w:rFonts w:ascii="Arial" w:eastAsia="Times New Roman" w:hAnsi="Arial" w:cs="Arial"/>
-                <w:sz w:val="22"/>
-              </w:rPr>
-              <w:t>Autocomplete Component</w:t>
-            </w:r>
-          </w:p>
-        </w:tc>
-      </w:tr>
-      <w:tr>
-        <w:tc>
-          <w:tcPr>
-            <w:cnfStyle w:val="001000000000" w:firstRow="0" w:lastRow="0" w:firstColumn="1" w:lastColumn="0" w:oddVBand="0" w:evenVBand="0" w:oddHBand="0" w:evenHBand="0" w:firstRowFirstColumn="0" w:firstRowLastColumn="0" w:lastRowFirstColumn="0" w:lastRowLastColumn="0"/>
-            <w:tcW w:w="0" w:type="auto"/>
-            <w:tcBorders>
-              <w:bottom w:val="nil"/>
-            </w:tcBorders>
-          </w:tcPr>
-          <w:p>
-            <w:pPr>
-              <w:rPr>
-                <w:rFonts w:ascii="Arial" w:eastAsia="Times New Roman" w:hAnsi="Arial" w:cs="Arial"/>
-                <w:sz w:val="22"/>
-              </w:rPr>
-            </w:pPr>
-          </w:p>
-        </w:tc>
-        <w:tc>
-          <w:tcPr>
-            <w:tcW w:w="0" w:type="auto"/>
-            <w:shd w:val="clear" w:color="auto" w:fill="CCCCCC"/>
-          </w:tcPr>
-          <w:p>
-            <w:pPr>
-              <w:cnfStyle w:val="000000000000" w:firstRow="0" w:lastRow="0" w:firstColumn="0" w:lastColumn="0" w:oddVBand="0" w:evenVBand="0" w:oddHBand="0" w:evenHBand="0" w:firstRowFirstColumn="0" w:firstRowLastColumn="0" w:lastRowFirstColumn="0" w:lastRowLastColumn="0"/>
-              <w:rPr>
-                <w:rFonts w:ascii="Arial" w:eastAsia="Times New Roman" w:hAnsi="Arial" w:cs="Arial"/>
-                <w:sz w:val="22"/>
-              </w:rPr>
-            </w:pPr>
-            <w:r>
-              <w:rPr>
-                <w:rFonts w:ascii="Arial" w:eastAsia="Times New Roman" w:hAnsi="Arial" w:cs="Arial"/>
-                <w:sz w:val="22"/>
-              </w:rPr>
-              <w:t>Result Ranking</w:t>
-            </w:r>
-          </w:p>
-        </w:tc>
-      </w:tr>
-      <w:tr>
-        <w:trPr>
-          <w:cnfStyle w:val="000000100000" w:firstRow="0" w:lastRow="0" w:firstColumn="0" w:lastColumn="0" w:oddVBand="0" w:evenVBand="0" w:oddHBand="1" w:evenHBand="0" w:firstRowFirstColumn="0" w:firstRowLastColumn="0" w:lastRowFirstColumn="0" w:lastRowLastColumn="0"/>
-        </w:trPr>
-        <w:tc>
-          <w:tcPr>
-            <w:cnfStyle w:val="001000000000" w:firstRow="0" w:lastRow="0" w:firstColumn="1" w:lastColumn="0" w:oddVBand="0" w:evenVBand="0" w:oddHBand="0" w:evenHBand="0" w:firstRowFirstColumn="0" w:firstRowLastColumn="0" w:lastRowFirstColumn="0" w:lastRowLastColumn="0"/>
-            <w:tcW w:w="0" w:type="auto"/>
-            <w:tcBorders>
               <w:top w:val="single" w:sz="4" w:space="0" w:color="666666" w:themeColor="text1" w:themeTint="99"/>
             </w:tcBorders>
+            <w:shd w:val="clear" w:color="auto" w:fill="auto"/>
             <w:hideMark/>
           </w:tcPr>
           <w:p>
@@ -10934,6 +10845,7 @@
         <w:tc>
           <w:tcPr>
             <w:tcW w:w="0" w:type="auto"/>
+            <w:shd w:val="clear" w:color="auto" w:fill="auto"/>
             <w:hideMark/>
           </w:tcPr>
           <w:p>
@@ -10955,6 +10867,7 @@
             <w:tcBorders>
               <w:bottom w:val="single" w:sz="4" w:space="0" w:color="666666" w:themeColor="text1" w:themeTint="99"/>
             </w:tcBorders>
+            <w:shd w:val="clear" w:color="auto" w:fill="CCCCCC"/>
             <w:hideMark/>
           </w:tcPr>
           <w:p>
@@ -10979,6 +10892,7 @@
             <w:tcBorders>
               <w:bottom w:val="single" w:sz="4" w:space="0" w:color="666666" w:themeColor="text1" w:themeTint="99"/>
             </w:tcBorders>
+            <w:shd w:val="clear" w:color="auto" w:fill="CCCCCC"/>
             <w:hideMark/>
           </w:tcPr>
           <w:p>
@@ -11115,6 +11029,16 @@
       </w:pPr>
     </w:p>
     <w:p>
+      <w:pPr>
+        <w:keepNext/>
+        <w:spacing w:before="240" w:line="278" w:lineRule="auto"/>
+        <w:rPr>
+          <w:rFonts w:ascii="Arial" w:eastAsia="Times New Roman" w:hAnsi="Arial" w:cs="Arial"/>
+          <w:b/>
+          <w:bCs/>
+          <w:lang w:eastAsia="en-US"/>
+        </w:rPr>
+      </w:pPr>
       <w:r>
         <w:rPr>
           <w:rFonts w:ascii="Arial" w:eastAsia="Times New Roman" w:hAnsi="Arial" w:cs="Arial"/>
@@ -11487,9 +11411,6 @@
             <w:cnfStyle w:val="001000000000" w:firstRow="0" w:lastRow="0" w:firstColumn="1" w:lastColumn="0" w:oddVBand="0" w:evenVBand="0" w:oddHBand="0" w:evenHBand="0" w:firstRowFirstColumn="0" w:firstRowLastColumn="0" w:lastRowFirstColumn="0" w:lastRowLastColumn="0"/>
             <w:tcW w:w="0" w:type="auto"/>
             <w:vMerge/>
-            <w:tcBorders>
-              <w:bottom w:val="nil"/>
-            </w:tcBorders>
           </w:tcPr>
           <w:p>
             <w:pPr>
@@ -11528,9 +11449,7 @@
           <w:tcPr>
             <w:cnfStyle w:val="001000000000" w:firstRow="0" w:lastRow="0" w:firstColumn="1" w:lastColumn="0" w:oddVBand="0" w:evenVBand="0" w:oddHBand="0" w:evenHBand="0" w:firstRowFirstColumn="0" w:firstRowLastColumn="0" w:lastRowFirstColumn="0" w:lastRowLastColumn="0"/>
             <w:tcW w:w="0" w:type="auto"/>
-            <w:tcBorders>
-              <w:bottom w:val="nil"/>
-            </w:tcBorders>
+            <w:vMerge/>
           </w:tcPr>
           <w:p>
             <w:pPr>
@@ -11572,9 +11491,7 @@
           <w:tcPr>
             <w:cnfStyle w:val="001000000000" w:firstRow="0" w:lastRow="0" w:firstColumn="1" w:lastColumn="0" w:oddVBand="0" w:evenVBand="0" w:oddHBand="0" w:evenHBand="0" w:firstRowFirstColumn="0" w:firstRowLastColumn="0" w:lastRowFirstColumn="0" w:lastRowLastColumn="0"/>
             <w:tcW w:w="0" w:type="auto"/>
-            <w:tcBorders>
-              <w:bottom w:val="nil"/>
-            </w:tcBorders>
+            <w:vMerge/>
           </w:tcPr>
           <w:p>
             <w:pPr>
@@ -11613,6 +11530,7 @@
           <w:tcPr>
             <w:cnfStyle w:val="001000000000" w:firstRow="0" w:lastRow="0" w:firstColumn="1" w:lastColumn="0" w:oddVBand="0" w:evenVBand="0" w:oddHBand="0" w:evenHBand="0" w:firstRowFirstColumn="0" w:firstRowLastColumn="0" w:lastRowFirstColumn="0" w:lastRowLastColumn="0"/>
             <w:tcW w:w="0" w:type="auto"/>
+            <w:vMerge/>
             <w:tcBorders>
               <w:bottom w:val="nil"/>
             </w:tcBorders>
@@ -11861,6 +11779,16 @@
       </w:pPr>
     </w:p>
     <w:p>
+      <w:pPr>
+        <w:keepNext/>
+        <w:spacing w:before="240" w:line="278" w:lineRule="auto"/>
+        <w:rPr>
+          <w:rFonts w:ascii="Arial" w:eastAsia="Times New Roman" w:hAnsi="Arial" w:cs="Arial"/>
+          <w:b/>
+          <w:bCs/>
+          <w:lang w:eastAsia="en-US"/>
+        </w:rPr>
+      </w:pPr>
       <w:r>
         <w:rPr>
           <w:rFonts w:ascii="Arial" w:eastAsia="Times New Roman" w:hAnsi="Arial" w:cs="Arial"/>
@@ -12233,9 +12161,6 @@
             <w:cnfStyle w:val="001000000000" w:firstRow="0" w:lastRow="0" w:firstColumn="1" w:lastColumn="0" w:oddVBand="0" w:evenVBand="0" w:oddHBand="0" w:evenHBand="0" w:firstRowFirstColumn="0" w:firstRowLastColumn="0" w:lastRowFirstColumn="0" w:lastRowLastColumn="0"/>
             <w:tcW w:w="0" w:type="auto"/>
             <w:vMerge/>
-            <w:tcBorders>
-              <w:bottom w:val="nil"/>
-            </w:tcBorders>
           </w:tcPr>
           <w:p>
             <w:pPr>
@@ -12274,9 +12199,7 @@
           <w:tcPr>
             <w:cnfStyle w:val="001000000000" w:firstRow="0" w:lastRow="0" w:firstColumn="1" w:lastColumn="0" w:oddVBand="0" w:evenVBand="0" w:oddHBand="0" w:evenHBand="0" w:firstRowFirstColumn="0" w:firstRowLastColumn="0" w:lastRowFirstColumn="0" w:lastRowLastColumn="0"/>
             <w:tcW w:w="0" w:type="auto"/>
-            <w:tcBorders>
-              <w:bottom w:val="nil"/>
-            </w:tcBorders>
+            <w:vMerge/>
           </w:tcPr>
           <w:p>
             <w:pPr>
@@ -12318,6 +12241,7 @@
           <w:tcPr>
             <w:cnfStyle w:val="001000000000" w:firstRow="0" w:lastRow="0" w:firstColumn="1" w:lastColumn="0" w:oddVBand="0" w:evenVBand="0" w:oddHBand="0" w:evenHBand="0" w:firstRowFirstColumn="0" w:firstRowLastColumn="0" w:lastRowFirstColumn="0" w:lastRowLastColumn="0"/>
             <w:tcW w:w="0" w:type="auto"/>
+            <w:vMerge/>
             <w:tcBorders>
               <w:bottom w:val="nil"/>
             </w:tcBorders>
@@ -12568,6 +12492,16 @@
       </w:pPr>
     </w:p>
     <w:p>
+      <w:pPr>
+        <w:keepNext/>
+        <w:spacing w:before="240" w:line="278" w:lineRule="auto"/>
+        <w:rPr>
+          <w:rFonts w:ascii="Arial" w:eastAsia="Times New Roman" w:hAnsi="Arial" w:cs="Arial"/>
+          <w:b/>
+          <w:bCs/>
+          <w:lang w:eastAsia="en-US"/>
+        </w:rPr>
+      </w:pPr>
       <w:bookmarkStart w:id="0" w:name="_Hlk230210208"/>
       <w:r>
         <w:rPr>
@@ -13189,6 +13123,16 @@
       </w:r>
     </w:p>
     <w:p>
+      <w:pPr>
+        <w:keepNext/>
+        <w:spacing w:before="240" w:line="278" w:lineRule="auto"/>
+        <w:rPr>
+          <w:rFonts w:ascii="Arial" w:eastAsia="Times New Roman" w:hAnsi="Arial" w:cs="Arial"/>
+          <w:b/>
+          <w:bCs/>
+          <w:lang w:eastAsia="en-US"/>
+        </w:rPr>
+      </w:pPr>
       <w:r>
         <w:rPr>
           <w:rFonts w:ascii="Arial" w:eastAsia="Times New Roman" w:hAnsi="Arial" w:cs="Arial"/>
@@ -13561,9 +13505,6 @@
             <w:cnfStyle w:val="001000000000" w:firstRow="0" w:lastRow="0" w:firstColumn="1" w:lastColumn="0" w:oddVBand="0" w:evenVBand="0" w:oddHBand="0" w:evenHBand="0" w:firstRowFirstColumn="0" w:firstRowLastColumn="0" w:lastRowFirstColumn="0" w:lastRowLastColumn="0"/>
             <w:tcW w:w="0" w:type="auto"/>
             <w:vMerge/>
-            <w:tcBorders>
-              <w:bottom w:val="nil"/>
-            </w:tcBorders>
           </w:tcPr>
           <w:p>
             <w:pPr>
@@ -13602,9 +13543,7 @@
           <w:tcPr>
             <w:cnfStyle w:val="001000000000" w:firstRow="0" w:lastRow="0" w:firstColumn="1" w:lastColumn="0" w:oddVBand="0" w:evenVBand="0" w:oddHBand="0" w:evenHBand="0" w:firstRowFirstColumn="0" w:firstRowLastColumn="0" w:lastRowFirstColumn="0" w:lastRowLastColumn="0"/>
             <w:tcW w:w="0" w:type="auto"/>
-            <w:tcBorders>
-              <w:bottom w:val="nil"/>
-            </w:tcBorders>
+            <w:vMerge/>
           </w:tcPr>
           <w:p>
             <w:pPr>
@@ -13646,6 +13585,7 @@
           <w:tcPr>
             <w:cnfStyle w:val="001000000000" w:firstRow="0" w:lastRow="0" w:firstColumn="1" w:lastColumn="0" w:oddVBand="0" w:evenVBand="0" w:oddHBand="0" w:evenHBand="0" w:firstRowFirstColumn="0" w:firstRowLastColumn="0" w:lastRowFirstColumn="0" w:lastRowLastColumn="0"/>
             <w:tcW w:w="0" w:type="auto"/>
+            <w:vMerge/>
             <w:tcBorders>
               <w:bottom w:val="nil"/>
             </w:tcBorders>
@@ -13886,6 +13826,16 @@
       </w:r>
     </w:p>
     <w:p>
+      <w:pPr>
+        <w:keepNext/>
+        <w:spacing w:before="240" w:line="278" w:lineRule="auto"/>
+        <w:rPr>
+          <w:rFonts w:ascii="Arial" w:eastAsia="Times New Roman" w:hAnsi="Arial" w:cs="Arial"/>
+          <w:b/>
+          <w:bCs/>
+          <w:lang w:eastAsia="en-US"/>
+        </w:rPr>
+      </w:pPr>
       <w:r>
         <w:rPr>
           <w:rFonts w:ascii="Arial" w:eastAsia="Times New Roman" w:hAnsi="Arial" w:cs="Arial"/>
@@ -15021,7 +14971,7 @@
 </file>
 
 <file path=word/endnotes.xml><?xml version="1.0" encoding="utf-8"?>
-<w:endnotes xmlns:wpc="http://schemas.microsoft.com/office/word/2010/wordprocessingCanvas" xmlns:cx="http://schemas.microsoft.com/office/drawing/2014/chartex" xmlns:cx1="http://schemas.microsoft.com/office/drawing/2015/9/8/chartex" xmlns:cx2="http://schemas.microsoft.com/office/drawing/2015/10/21/chartex" xmlns:cx3="http://schemas.microsoft.com/office/drawing/2016/5/9/chartex" xmlns:cx4="http://schemas.microsoft.com/office/drawing/2016/5/10/chartex" xmlns:cx5="http://schemas.microsoft.com/office/drawing/2016/5/11/chartex" xmlns:cx6="http://schemas.microsoft.com/office/drawing/2016/5/12/chartex" xmlns:cx7="http://schemas.microsoft.com/office/drawing/2016/5/13/chartex" xmlns:cx8="http://schemas.microsoft.com/office/drawing/2016/5/14/chartex" xmlns:mc="http://schemas.openxmlformats.org/markup-compatibility/2006" xmlns:aink="http://schemas.microsoft.com/office/drawing/2016/ink" xmlns:am3d="http://schemas.microsoft.com/office/drawing/2017/model3d" xmlns:o="urn:schemas-microsoft-com:office:office" xmlns:oel="http://schemas.microsoft.com/office/2019/extlst" xmlns:r="http://schemas.openxmlformats.org/officeDocument/2006/relationships" xmlns:m="http://schemas.openxmlformats.org/officeDocument/2006/math" xmlns:v="urn:schemas-microsoft-com:vml" xmlns:wp14="http://schemas.microsoft.com/office/word/2010/wordprocessingDrawing" xmlns:wp="http://schemas.openxmlformats.org/drawingml/2006/wordprocessingDrawing" xmlns:w10="urn:schemas-microsoft-com:office:word" xmlns:w="http://schemas.openxmlformats.org/wordprocessingml/2006/main" xmlns:w14="http://schemas.microsoft.com/office/word/2010/wordml" xmlns:w15="http://schemas.microsoft.com/office/word/2012/wordml" xmlns:w16cex="http://schemas.microsoft.com/office/word/2018/wordml/cex" xmlns:w16cid="http://schemas.microsoft.com/office/word/2016/wordml/cid" xmlns:w16="http://schemas.microsoft.com/office/word/2018/wordml" xmlns:w16sdtdh="http://schemas.microsoft.com/office/word/2020/wordml/sdtdatahash" xmlns:w16se="http://schemas.microsoft.com/office/word/2015/wordml/symex" xmlns:wpg="http://schemas.microsoft.com/office/word/2010/wordprocessingGroup" xmlns:wpi="http://schemas.microsoft.com/office/word/2010/wordprocessingInk" xmlns:wne="http://schemas.microsoft.com/office/word/2006/wordml" xmlns:wps="http://schemas.microsoft.com/office/word/2010/wordprocessingShape" mc:Ignorable="w14 w15 w16se w16cid w16 w16cex w16sdtdh wp14">
+<w:endnotes xmlns:wpc="http://schemas.microsoft.com/office/word/2010/wordprocessingCanvas" xmlns:cx="http://schemas.microsoft.com/office/drawing/2014/chartex" xmlns:cx1="http://schemas.microsoft.com/office/drawing/2015/9/8/chartex" xmlns:cx2="http://schemas.microsoft.com/office/drawing/2015/10/21/chartex" xmlns:cx3="http://schemas.microsoft.com/office/drawing/2016/5/9/chartex" xmlns:cx4="http://schemas.microsoft.com/office/drawing/2016/5/10/chartex" xmlns:cx5="http://schemas.microsoft.com/office/drawing/2016/5/11/chartex" xmlns:cx6="http://schemas.microsoft.com/office/drawing/2016/5/12/chartex" xmlns:cx7="http://schemas.microsoft.com/office/drawing/2016/5/13/chartex" xmlns:cx8="http://schemas.microsoft.com/office/drawing/2016/5/14/chartex" xmlns:mc="http://schemas.openxmlformats.org/markup-compatibility/2006" xmlns:aink="http://schemas.microsoft.com/office/drawing/2016/ink" xmlns:am3d="http://schemas.microsoft.com/office/drawing/2017/model3d" xmlns:o="urn:schemas-microsoft-com:office:office" xmlns:oel="http://schemas.microsoft.com/office/2019/extlst" xmlns:r="http://schemas.openxmlformats.org/officeDocument/2006/relationships" xmlns:m="http://schemas.openxmlformats.org/officeDocument/2006/math" xmlns:v="urn:schemas-microsoft-com:vml" xmlns:wp14="http://schemas.microsoft.com/office/word/2010/wordprocessingDrawing" xmlns:wp="http://schemas.openxmlformats.org/drawingml/2006/wordprocessingDrawing" xmlns:w10="urn:schemas-microsoft-com:office:word" xmlns:w="http://schemas.openxmlformats.org/wordprocessingml/2006/main" xmlns:w14="http://schemas.microsoft.com/office/word/2010/wordml" xmlns:w15="http://schemas.microsoft.com/office/word/2012/wordml" xmlns:w16cex="http://schemas.microsoft.com/office/word/2018/wordml/cex" xmlns:w16cid="http://schemas.microsoft.com/office/word/2016/wordml/cid" xmlns:w16="http://schemas.microsoft.com/office/word/2018/wordml" xmlns:w16du="http://schemas.microsoft.com/office/word/2023/wordml/word16du" xmlns:w16sdtdh="http://schemas.microsoft.com/office/word/2020/wordml/sdtdatahash" xmlns:w16sdtfl="http://schemas.microsoft.com/office/word/2024/wordml/sdtformatlock" xmlns:w16se="http://schemas.microsoft.com/office/word/2015/wordml/symex" xmlns:wpg="http://schemas.microsoft.com/office/word/2010/wordprocessingGroup" xmlns:wpi="http://schemas.microsoft.com/office/word/2010/wordprocessingInk" xmlns:wne="http://schemas.microsoft.com/office/word/2006/wordml" xmlns:wps="http://schemas.microsoft.com/office/word/2010/wordprocessingShape" mc:Ignorable="w14 w15 w16se w16cid w16 w16cex w16sdtdh w16sdtfl w16du wp14">
   <w:endnote w:type="separator" w:id="-1">
     <w:p>
       <w:pPr>
@@ -15046,7 +14996,7 @@
 </file>
 
 <file path=word/footer1.xml><?xml version="1.0" encoding="utf-8"?>
-<w:ftr xmlns:wpc="http://schemas.microsoft.com/office/word/2010/wordprocessingCanvas" xmlns:cx="http://schemas.microsoft.com/office/drawing/2014/chartex" xmlns:cx1="http://schemas.microsoft.com/office/drawing/2015/9/8/chartex" xmlns:cx2="http://schemas.microsoft.com/office/drawing/2015/10/21/chartex" xmlns:cx3="http://schemas.microsoft.com/office/drawing/2016/5/9/chartex" xmlns:cx4="http://schemas.microsoft.com/office/drawing/2016/5/10/chartex" xmlns:cx5="http://schemas.microsoft.com/office/drawing/2016/5/11/chartex" xmlns:cx6="http://schemas.microsoft.com/office/drawing/2016/5/12/chartex" xmlns:cx7="http://schemas.microsoft.com/office/drawing/2016/5/13/chartex" xmlns:cx8="http://schemas.microsoft.com/office/drawing/2016/5/14/chartex" xmlns:mc="http://schemas.openxmlformats.org/markup-compatibility/2006" xmlns:aink="http://schemas.microsoft.com/office/drawing/2016/ink" xmlns:am3d="http://schemas.microsoft.com/office/drawing/2017/model3d" xmlns:o="urn:schemas-microsoft-com:office:office" xmlns:oel="http://schemas.microsoft.com/office/2019/extlst" xmlns:r="http://schemas.openxmlformats.org/officeDocument/2006/relationships" xmlns:m="http://schemas.openxmlformats.org/officeDocument/2006/math" xmlns:v="urn:schemas-microsoft-com:vml" xmlns:wp14="http://schemas.microsoft.com/office/word/2010/wordprocessingDrawing" xmlns:wp="http://schemas.openxmlformats.org/drawingml/2006/wordprocessingDrawing" xmlns:w10="urn:schemas-microsoft-com:office:word" xmlns:w="http://schemas.openxmlformats.org/wordprocessingml/2006/main" xmlns:w14="http://schemas.microsoft.com/office/word/2010/wordml" xmlns:w15="http://schemas.microsoft.com/office/word/2012/wordml" xmlns:w16cex="http://schemas.microsoft.com/office/word/2018/wordml/cex" xmlns:w16cid="http://schemas.microsoft.com/office/word/2016/wordml/cid" xmlns:w16="http://schemas.microsoft.com/office/word/2018/wordml" xmlns:w16sdtdh="http://schemas.microsoft.com/office/word/2020/wordml/sdtdatahash" xmlns:w16se="http://schemas.microsoft.com/office/word/2015/wordml/symex" xmlns:wpg="http://schemas.microsoft.com/office/word/2010/wordprocessingGroup" xmlns:wpi="http://schemas.microsoft.com/office/word/2010/wordprocessingInk" xmlns:wne="http://schemas.microsoft.com/office/word/2006/wordml" xmlns:wps="http://schemas.microsoft.com/office/word/2010/wordprocessingShape" mc:Ignorable="w14 w15 w16se w16cid w16 w16cex w16sdtdh wp14">
+<w:ftr xmlns:wpc="http://schemas.microsoft.com/office/word/2010/wordprocessingCanvas" xmlns:cx="http://schemas.microsoft.com/office/drawing/2014/chartex" xmlns:cx1="http://schemas.microsoft.com/office/drawing/2015/9/8/chartex" xmlns:cx2="http://schemas.microsoft.com/office/drawing/2015/10/21/chartex" xmlns:cx3="http://schemas.microsoft.com/office/drawing/2016/5/9/chartex" xmlns:cx4="http://schemas.microsoft.com/office/drawing/2016/5/10/chartex" xmlns:cx5="http://schemas.microsoft.com/office/drawing/2016/5/11/chartex" xmlns:cx6="http://schemas.microsoft.com/office/drawing/2016/5/12/chartex" xmlns:cx7="http://schemas.microsoft.com/office/drawing/2016/5/13/chartex" xmlns:cx8="http://schemas.microsoft.com/office/drawing/2016/5/14/chartex" xmlns:mc="http://schemas.openxmlformats.org/markup-compatibility/2006" xmlns:aink="http://schemas.microsoft.com/office/drawing/2016/ink" xmlns:am3d="http://schemas.microsoft.com/office/drawing/2017/model3d" xmlns:o="urn:schemas-microsoft-com:office:office" xmlns:oel="http://schemas.microsoft.com/office/2019/extlst" xmlns:r="http://schemas.openxmlformats.org/officeDocument/2006/relationships" xmlns:m="http://schemas.openxmlformats.org/officeDocument/2006/math" xmlns:v="urn:schemas-microsoft-com:vml" xmlns:wp14="http://schemas.microsoft.com/office/word/2010/wordprocessingDrawing" xmlns:wp="http://schemas.openxmlformats.org/drawingml/2006/wordprocessingDrawing" xmlns:w10="urn:schemas-microsoft-com:office:word" xmlns:w="http://schemas.openxmlformats.org/wordprocessingml/2006/main" xmlns:w14="http://schemas.microsoft.com/office/word/2010/wordml" xmlns:w15="http://schemas.microsoft.com/office/word/2012/wordml" xmlns:w16cex="http://schemas.microsoft.com/office/word/2018/wordml/cex" xmlns:w16cid="http://schemas.microsoft.com/office/word/2016/wordml/cid" xmlns:w16="http://schemas.microsoft.com/office/word/2018/wordml" xmlns:w16du="http://schemas.microsoft.com/office/word/2023/wordml/word16du" xmlns:w16sdtdh="http://schemas.microsoft.com/office/word/2020/wordml/sdtdatahash" xmlns:w16sdtfl="http://schemas.microsoft.com/office/word/2024/wordml/sdtformatlock" xmlns:w16se="http://schemas.microsoft.com/office/word/2015/wordml/symex" xmlns:wpg="http://schemas.microsoft.com/office/word/2010/wordprocessingGroup" xmlns:wpi="http://schemas.microsoft.com/office/word/2010/wordprocessingInk" xmlns:wne="http://schemas.microsoft.com/office/word/2006/wordml" xmlns:wps="http://schemas.microsoft.com/office/word/2010/wordprocessingShape" mc:Ignorable="w14 w15 w16se w16cid w16 w16cex w16sdtdh w16sdtfl w16du wp14">
   <w:tbl>
     <w:tblPr>
       <w:tblW w:w="0" w:type="auto"/>
@@ -15106,7 +15056,7 @@
 </file>
 
 <file path=word/footnotes.xml><?xml version="1.0" encoding="utf-8"?>
-<w:footnotes xmlns:wpc="http://schemas.microsoft.com/office/word/2010/wordprocessingCanvas" xmlns:cx="http://schemas.microsoft.com/office/drawing/2014/chartex" xmlns:cx1="http://schemas.microsoft.com/office/drawing/2015/9/8/chartex" xmlns:cx2="http://schemas.microsoft.com/office/drawing/2015/10/21/chartex" xmlns:cx3="http://schemas.microsoft.com/office/drawing/2016/5/9/chartex" xmlns:cx4="http://schemas.microsoft.com/office/drawing/2016/5/10/chartex" xmlns:cx5="http://schemas.microsoft.com/office/drawing/2016/5/11/chartex" xmlns:cx6="http://schemas.microsoft.com/office/drawing/2016/5/12/chartex" xmlns:cx7="http://schemas.microsoft.com/office/drawing/2016/5/13/chartex" xmlns:cx8="http://schemas.microsoft.com/office/drawing/2016/5/14/chartex" xmlns:mc="http://schemas.openxmlformats.org/markup-compatibility/2006" xmlns:aink="http://schemas.microsoft.com/office/drawing/2016/ink" xmlns:am3d="http://schemas.microsoft.com/office/drawing/2017/model3d" xmlns:o="urn:schemas-microsoft-com:office:office" xmlns:oel="http://schemas.microsoft.com/office/2019/extlst" xmlns:r="http://schemas.openxmlformats.org/officeDocument/2006/relationships" xmlns:m="http://schemas.openxmlformats.org/officeDocument/2006/math" xmlns:v="urn:schemas-microsoft-com:vml" xmlns:wp14="http://schemas.microsoft.com/office/word/2010/wordprocessingDrawing" xmlns:wp="http://schemas.openxmlformats.org/drawingml/2006/wordprocessingDrawing" xmlns:w10="urn:schemas-microsoft-com:office:word" xmlns:w="http://schemas.openxmlformats.org/wordprocessingml/2006/main" xmlns:w14="http://schemas.microsoft.com/office/word/2010/wordml" xmlns:w15="http://schemas.microsoft.com/office/word/2012/wordml" xmlns:w16cex="http://schemas.microsoft.com/office/word/2018/wordml/cex" xmlns:w16cid="http://schemas.microsoft.com/office/word/2016/wordml/cid" xmlns:w16="http://schemas.microsoft.com/office/word/2018/wordml" xmlns:w16sdtdh="http://schemas.microsoft.com/office/word/2020/wordml/sdtdatahash" xmlns:w16se="http://schemas.microsoft.com/office/word/2015/wordml/symex" xmlns:wpg="http://schemas.microsoft.com/office/word/2010/wordprocessingGroup" xmlns:wpi="http://schemas.microsoft.com/office/word/2010/wordprocessingInk" xmlns:wne="http://schemas.microsoft.com/office/word/2006/wordml" xmlns:wps="http://schemas.microsoft.com/office/word/2010/wordprocessingShape" mc:Ignorable="w14 w15 w16se w16cid w16 w16cex w16sdtdh wp14">
+<w:footnotes xmlns:wpc="http://schemas.microsoft.com/office/word/2010/wordprocessingCanvas" xmlns:cx="http://schemas.microsoft.com/office/drawing/2014/chartex" xmlns:cx1="http://schemas.microsoft.com/office/drawing/2015/9/8/chartex" xmlns:cx2="http://schemas.microsoft.com/office/drawing/2015/10/21/chartex" xmlns:cx3="http://schemas.microsoft.com/office/drawing/2016/5/9/chartex" xmlns:cx4="http://schemas.microsoft.com/office/drawing/2016/5/10/chartex" xmlns:cx5="http://schemas.microsoft.com/office/drawing/2016/5/11/chartex" xmlns:cx6="http://schemas.microsoft.com/office/drawing/2016/5/12/chartex" xmlns:cx7="http://schemas.microsoft.com/office/drawing/2016/5/13/chartex" xmlns:cx8="http://schemas.microsoft.com/office/drawing/2016/5/14/chartex" xmlns:mc="http://schemas.openxmlformats.org/markup-compatibility/2006" xmlns:aink="http://schemas.microsoft.com/office/drawing/2016/ink" xmlns:am3d="http://schemas.microsoft.com/office/drawing/2017/model3d" xmlns:o="urn:schemas-microsoft-com:office:office" xmlns:oel="http://schemas.microsoft.com/office/2019/extlst" xmlns:r="http://schemas.openxmlformats.org/officeDocument/2006/relationships" xmlns:m="http://schemas.openxmlformats.org/officeDocument/2006/math" xmlns:v="urn:schemas-microsoft-com:vml" xmlns:wp14="http://schemas.microsoft.com/office/word/2010/wordprocessingDrawing" xmlns:wp="http://schemas.openxmlformats.org/drawingml/2006/wordprocessingDrawing" xmlns:w10="urn:schemas-microsoft-com:office:word" xmlns:w="http://schemas.openxmlformats.org/wordprocessingml/2006/main" xmlns:w14="http://schemas.microsoft.com/office/word/2010/wordml" xmlns:w15="http://schemas.microsoft.com/office/word/2012/wordml" xmlns:w16cex="http://schemas.microsoft.com/office/word/2018/wordml/cex" xmlns:w16cid="http://schemas.microsoft.com/office/word/2016/wordml/cid" xmlns:w16="http://schemas.microsoft.com/office/word/2018/wordml" xmlns:w16du="http://schemas.microsoft.com/office/word/2023/wordml/word16du" xmlns:w16sdtdh="http://schemas.microsoft.com/office/word/2020/wordml/sdtdatahash" xmlns:w16sdtfl="http://schemas.microsoft.com/office/word/2024/wordml/sdtformatlock" xmlns:w16se="http://schemas.microsoft.com/office/word/2015/wordml/symex" xmlns:wpg="http://schemas.microsoft.com/office/word/2010/wordprocessingGroup" xmlns:wpi="http://schemas.microsoft.com/office/word/2010/wordprocessingInk" xmlns:wne="http://schemas.microsoft.com/office/word/2006/wordml" xmlns:wps="http://schemas.microsoft.com/office/word/2010/wordprocessingShape" mc:Ignorable="w14 w15 w16se w16cid w16 w16cex w16sdtdh w16sdtfl w16du wp14">
   <w:footnote w:type="separator" w:id="-1">
     <w:p>
       <w:pPr>
@@ -15131,7 +15081,7 @@
 </file>
 
 <file path=word/header1.xml><?xml version="1.0" encoding="utf-8"?>
-<w:hdr xmlns:wpc="http://schemas.microsoft.com/office/word/2010/wordprocessingCanvas" xmlns:cx="http://schemas.microsoft.com/office/drawing/2014/chartex" xmlns:cx1="http://schemas.microsoft.com/office/drawing/2015/9/8/chartex" xmlns:cx2="http://schemas.microsoft.com/office/drawing/2015/10/21/chartex" xmlns:cx3="http://schemas.microsoft.com/office/drawing/2016/5/9/chartex" xmlns:cx4="http://schemas.microsoft.com/office/drawing/2016/5/10/chartex" xmlns:cx5="http://schemas.microsoft.com/office/drawing/2016/5/11/chartex" xmlns:cx6="http://schemas.microsoft.com/office/drawing/2016/5/12/chartex" xmlns:cx7="http://schemas.microsoft.com/office/drawing/2016/5/13/chartex" xmlns:cx8="http://schemas.microsoft.com/office/drawing/2016/5/14/chartex" xmlns:mc="http://schemas.openxmlformats.org/markup-compatibility/2006" xmlns:aink="http://schemas.microsoft.com/office/drawing/2016/ink" xmlns:am3d="http://schemas.microsoft.com/office/drawing/2017/model3d" xmlns:o="urn:schemas-microsoft-com:office:office" xmlns:oel="http://schemas.microsoft.com/office/2019/extlst" xmlns:r="http://schemas.openxmlformats.org/officeDocument/2006/relationships" xmlns:m="http://schemas.openxmlformats.org/officeDocument/2006/math" xmlns:v="urn:schemas-microsoft-com:vml" xmlns:wp14="http://schemas.microsoft.com/office/word/2010/wordprocessingDrawing" xmlns:wp="http://schemas.openxmlformats.org/drawingml/2006/wordprocessingDrawing" xmlns:w10="urn:schemas-microsoft-com:office:word" xmlns:w="http://schemas.openxmlformats.org/wordprocessingml/2006/main" xmlns:w14="http://schemas.microsoft.com/office/word/2010/wordml" xmlns:w15="http://schemas.microsoft.com/office/word/2012/wordml" xmlns:w16cex="http://schemas.microsoft.com/office/word/2018/wordml/cex" xmlns:w16cid="http://schemas.microsoft.com/office/word/2016/wordml/cid" xmlns:w16="http://schemas.microsoft.com/office/word/2018/wordml" xmlns:w16sdtdh="http://schemas.microsoft.com/office/word/2020/wordml/sdtdatahash" xmlns:w16se="http://schemas.microsoft.com/office/word/2015/wordml/symex" xmlns:wpg="http://schemas.microsoft.com/office/word/2010/wordprocessingGroup" xmlns:wpi="http://schemas.microsoft.com/office/word/2010/wordprocessingInk" xmlns:wne="http://schemas.microsoft.com/office/word/2006/wordml" xmlns:wps="http://schemas.microsoft.com/office/word/2010/wordprocessingShape" mc:Ignorable="w14 w15 w16se w16cid w16 w16cex w16sdtdh wp14">
+<w:hdr xmlns:wpc="http://schemas.microsoft.com/office/word/2010/wordprocessingCanvas" xmlns:cx="http://schemas.microsoft.com/office/drawing/2014/chartex" xmlns:cx1="http://schemas.microsoft.com/office/drawing/2015/9/8/chartex" xmlns:cx2="http://schemas.microsoft.com/office/drawing/2015/10/21/chartex" xmlns:cx3="http://schemas.microsoft.com/office/drawing/2016/5/9/chartex" xmlns:cx4="http://schemas.microsoft.com/office/drawing/2016/5/10/chartex" xmlns:cx5="http://schemas.microsoft.com/office/drawing/2016/5/11/chartex" xmlns:cx6="http://schemas.microsoft.com/office/drawing/2016/5/12/chartex" xmlns:cx7="http://schemas.microsoft.com/office/drawing/2016/5/13/chartex" xmlns:cx8="http://schemas.microsoft.com/office/drawing/2016/5/14/chartex" xmlns:mc="http://schemas.openxmlformats.org/markup-compatibility/2006" xmlns:aink="http://schemas.microsoft.com/office/drawing/2016/ink" xmlns:am3d="http://schemas.microsoft.com/office/drawing/2017/model3d" xmlns:o="urn:schemas-microsoft-com:office:office" xmlns:oel="http://schemas.microsoft.com/office/2019/extlst" xmlns:r="http://schemas.openxmlformats.org/officeDocument/2006/relationships" xmlns:m="http://schemas.openxmlformats.org/officeDocument/2006/math" xmlns:v="urn:schemas-microsoft-com:vml" xmlns:wp14="http://schemas.microsoft.com/office/word/2010/wordprocessingDrawing" xmlns:wp="http://schemas.openxmlformats.org/drawingml/2006/wordprocessingDrawing" xmlns:w10="urn:schemas-microsoft-com:office:word" xmlns:w="http://schemas.openxmlformats.org/wordprocessingml/2006/main" xmlns:w14="http://schemas.microsoft.com/office/word/2010/wordml" xmlns:w15="http://schemas.microsoft.com/office/word/2012/wordml" xmlns:w16cex="http://schemas.microsoft.com/office/word/2018/wordml/cex" xmlns:w16cid="http://schemas.microsoft.com/office/word/2016/wordml/cid" xmlns:w16="http://schemas.microsoft.com/office/word/2018/wordml" xmlns:w16du="http://schemas.microsoft.com/office/word/2023/wordml/word16du" xmlns:w16sdtdh="http://schemas.microsoft.com/office/word/2020/wordml/sdtdatahash" xmlns:w16sdtfl="http://schemas.microsoft.com/office/word/2024/wordml/sdtformatlock" xmlns:w16se="http://schemas.microsoft.com/office/word/2015/wordml/symex" xmlns:wpg="http://schemas.microsoft.com/office/word/2010/wordprocessingGroup" xmlns:wpi="http://schemas.microsoft.com/office/word/2010/wordprocessingInk" xmlns:wne="http://schemas.microsoft.com/office/word/2006/wordml" xmlns:wps="http://schemas.microsoft.com/office/word/2010/wordprocessingShape" mc:Ignorable="w14 w15 w16se w16cid w16 w16cex w16sdtdh w16sdtfl w16du wp14">
   <w:sdt>
     <w:sdtPr>
       <w:id w:val="-1318336367"/>
@@ -15236,7 +15186,7 @@
 </file>
 
 <file path=word/styles.xml><?xml version="1.0" encoding="utf-8"?>
-<w:styles xmlns:mc="http://schemas.openxmlformats.org/markup-compatibility/2006" xmlns:r="http://schemas.openxmlformats.org/officeDocument/2006/relationships" xmlns:w="http://schemas.openxmlformats.org/wordprocessingml/2006/main" xmlns:w14="http://schemas.microsoft.com/office/word/2010/wordml" xmlns:w15="http://schemas.microsoft.com/office/word/2012/wordml" xmlns:w16cex="http://schemas.microsoft.com/office/word/2018/wordml/cex" xmlns:w16cid="http://schemas.microsoft.com/office/word/2016/wordml/cid" xmlns:w16="http://schemas.microsoft.com/office/word/2018/wordml" xmlns:w16sdtdh="http://schemas.microsoft.com/office/word/2020/wordml/sdtdatahash" xmlns:w16se="http://schemas.microsoft.com/office/word/2015/wordml/symex" mc:Ignorable="w14 w15 w16se w16cid w16 w16cex w16sdtdh">
+<w:styles xmlns:mc="http://schemas.openxmlformats.org/markup-compatibility/2006" xmlns:r="http://schemas.openxmlformats.org/officeDocument/2006/relationships" xmlns:w="http://schemas.openxmlformats.org/wordprocessingml/2006/main" xmlns:w14="http://schemas.microsoft.com/office/word/2010/wordml" xmlns:w15="http://schemas.microsoft.com/office/word/2012/wordml" xmlns:w16cex="http://schemas.microsoft.com/office/word/2018/wordml/cex" xmlns:w16cid="http://schemas.microsoft.com/office/word/2016/wordml/cid" xmlns:w16="http://schemas.microsoft.com/office/word/2018/wordml" xmlns:w16du="http://schemas.microsoft.com/office/word/2023/wordml/word16du" xmlns:w16sdtdh="http://schemas.microsoft.com/office/word/2020/wordml/sdtdatahash" xmlns:w16sdtfl="http://schemas.microsoft.com/office/word/2024/wordml/sdtformatlock" xmlns:w16se="http://schemas.microsoft.com/office/word/2015/wordml/symex" mc:Ignorable="w14 w15 w16se w16cid w16 w16cex w16sdtdh w16sdtfl w16du">
   <w:docDefaults>
     <w:rPrDefault>
       <w:rPr>

</xml_diff>

<commit_message>
Changed to consistent 12pt before and 8pt after spacing for sub headings
</commit_message>
<xml_diff>
--- a/04_QA_Review/Approved/Milestone_2_First_Dozen_Views/RA_M2_Comp_Diagram_Design_Info_Table_v01.docx
+++ b/04_QA_Review/Approved/Milestone_2_First_Dozen_Views/RA_M2_Comp_Diagram_Design_Info_Table_v01.docx
@@ -518,6 +518,10 @@
       </w:r>
     </w:p>
     <w:p>
+      <w:pPr>
+        <w:keepNext/>
+        <w:spacing w:before="240" w:line="278" w:lineRule="auto"/>
+      </w:pPr>
       <w:r>
         <w:rPr>
           <w:rFonts w:ascii="Arial" w:eastAsia="Times New Roman" w:hAnsi="Arial" w:cs="Arial"/>
@@ -953,9 +957,6 @@
             <w:cnfStyle w:val="001000000000" w:firstRow="0" w:lastRow="0" w:firstColumn="1" w:lastColumn="0" w:oddVBand="0" w:evenVBand="0" w:oddHBand="0" w:evenHBand="0" w:firstRowFirstColumn="0" w:firstRowLastColumn="0" w:lastRowFirstColumn="0" w:lastRowLastColumn="0"/>
             <w:tcW w:w="0" w:type="auto"/>
             <w:vMerge/>
-            <w:tcBorders>
-              <w:bottom w:val="nil"/>
-            </w:tcBorders>
           </w:tcPr>
           <w:p>
             <w:pPr>
@@ -994,10 +995,7 @@
           <w:tcPr>
             <w:cnfStyle w:val="001000000000" w:firstRow="0" w:lastRow="0" w:firstColumn="1" w:lastColumn="0" w:oddVBand="0" w:evenVBand="0" w:oddHBand="0" w:evenHBand="0" w:firstRowFirstColumn="0" w:firstRowLastColumn="0" w:lastRowFirstColumn="0" w:lastRowLastColumn="0"/>
             <w:tcW w:w="0" w:type="auto"/>
-            <w:tcBorders>
-              <w:top w:val="nil"/>
-              <w:bottom w:val="nil"/>
-            </w:tcBorders>
+            <w:vMerge/>
             <w:shd w:val="clear" w:color="auto" w:fill="D1D1D1" w:themeFill="background2" w:themeFillShade="E6"/>
           </w:tcPr>
           <w:p>
@@ -1040,10 +1038,7 @@
           <w:tcPr>
             <w:cnfStyle w:val="001000000000" w:firstRow="0" w:lastRow="0" w:firstColumn="1" w:lastColumn="0" w:oddVBand="0" w:evenVBand="0" w:oddHBand="0" w:evenHBand="0" w:firstRowFirstColumn="0" w:firstRowLastColumn="0" w:lastRowFirstColumn="0" w:lastRowLastColumn="0"/>
             <w:tcW w:w="0" w:type="auto"/>
-            <w:tcBorders>
-              <w:top w:val="nil"/>
-              <w:bottom w:val="nil"/>
-            </w:tcBorders>
+            <w:vMerge/>
             <w:shd w:val="clear" w:color="auto" w:fill="D1D1D1" w:themeFill="background2" w:themeFillShade="E6"/>
           </w:tcPr>
           <w:p>
@@ -1083,10 +1078,7 @@
           <w:tcPr>
             <w:cnfStyle w:val="001000000000" w:firstRow="0" w:lastRow="0" w:firstColumn="1" w:lastColumn="0" w:oddVBand="0" w:evenVBand="0" w:oddHBand="0" w:evenHBand="0" w:firstRowFirstColumn="0" w:firstRowLastColumn="0" w:lastRowFirstColumn="0" w:lastRowLastColumn="0"/>
             <w:tcW w:w="0" w:type="auto"/>
-            <w:tcBorders>
-              <w:top w:val="nil"/>
-              <w:bottom w:val="nil"/>
-            </w:tcBorders>
+            <w:vMerge/>
             <w:shd w:val="clear" w:color="auto" w:fill="D1D1D1" w:themeFill="background2" w:themeFillShade="E6"/>
           </w:tcPr>
           <w:p>
@@ -1129,10 +1121,7 @@
           <w:tcPr>
             <w:cnfStyle w:val="001000000000" w:firstRow="0" w:lastRow="0" w:firstColumn="1" w:lastColumn="0" w:oddVBand="0" w:evenVBand="0" w:oddHBand="0" w:evenHBand="0" w:firstRowFirstColumn="0" w:firstRowLastColumn="0" w:lastRowFirstColumn="0" w:lastRowLastColumn="0"/>
             <w:tcW w:w="0" w:type="auto"/>
-            <w:tcBorders>
-              <w:top w:val="nil"/>
-              <w:bottom w:val="nil"/>
-            </w:tcBorders>
+            <w:vMerge/>
             <w:shd w:val="clear" w:color="auto" w:fill="D1D1D1" w:themeFill="background2" w:themeFillShade="E6"/>
           </w:tcPr>
           <w:p>
@@ -1172,10 +1161,7 @@
           <w:tcPr>
             <w:cnfStyle w:val="001000000000" w:firstRow="0" w:lastRow="0" w:firstColumn="1" w:lastColumn="0" w:oddVBand="0" w:evenVBand="0" w:oddHBand="0" w:evenHBand="0" w:firstRowFirstColumn="0" w:firstRowLastColumn="0" w:lastRowFirstColumn="0" w:lastRowLastColumn="0"/>
             <w:tcW w:w="0" w:type="auto"/>
-            <w:tcBorders>
-              <w:top w:val="nil"/>
-              <w:bottom w:val="nil"/>
-            </w:tcBorders>
+            <w:vMerge/>
             <w:shd w:val="clear" w:color="auto" w:fill="D1D1D1" w:themeFill="background2" w:themeFillShade="E6"/>
           </w:tcPr>
           <w:p>
@@ -1218,8 +1204,8 @@
           <w:tcPr>
             <w:cnfStyle w:val="001000000000" w:firstRow="0" w:lastRow="0" w:firstColumn="1" w:lastColumn="0" w:oddVBand="0" w:evenVBand="0" w:oddHBand="0" w:evenHBand="0" w:firstRowFirstColumn="0" w:firstRowLastColumn="0" w:lastRowFirstColumn="0" w:lastRowLastColumn="0"/>
             <w:tcW w:w="0" w:type="auto"/>
+            <w:vMerge/>
             <w:tcBorders>
-              <w:top w:val="nil"/>
               <w:bottom w:val="single" w:sz="4" w:space="0" w:color="666666" w:themeColor="text1" w:themeTint="99"/>
             </w:tcBorders>
             <w:shd w:val="clear" w:color="auto" w:fill="D1D1D1" w:themeFill="background2" w:themeFillShade="E6"/>

</xml_diff>